<commit_message>
lab2 v0.9 - MSVC workin
</commit_message>
<xml_diff>
--- a/reports/report_2_TP1.docx
+++ b/reports/report_2_TP1.docx
@@ -537,9 +537,6 @@
     <w:p>
       <w:pPr>
         <w:pStyle w:val="-"/>
-        <w:rPr>
-          <w:lang w:val="en-US"/>
-        </w:rPr>
       </w:pPr>
       <w:r>
         <w:rPr>
@@ -756,47 +753,38 @@
       <w:pPr>
         <w:pStyle w:val="-"/>
         <w:ind w:firstLine="0"/>
-        <w:rPr>
-          <w:lang w:val="en-US"/>
-        </w:rPr>
-      </w:pPr>
-    </w:p>
-    <w:p>
-      <w:pPr>
-        <w:pStyle w:val="-"/>
-      </w:pPr>
-    </w:p>
-    <w:p>
-      <w:pPr>
-        <w:pStyle w:val="-"/>
-      </w:pPr>
-    </w:p>
-    <w:p>
-      <w:pPr>
-        <w:pStyle w:val="-"/>
-      </w:pPr>
-    </w:p>
-    <w:p>
-      <w:pPr>
-        <w:pStyle w:val="-"/>
-      </w:pPr>
-    </w:p>
-    <w:p>
-      <w:pPr>
-        <w:pStyle w:val="-"/>
-        <w:ind w:firstLine="0"/>
-        <w:rPr>
-          <w:lang w:val="en-US"/>
-        </w:rPr>
-      </w:pPr>
-    </w:p>
-    <w:p>
-      <w:pPr>
-        <w:pStyle w:val="-"/>
-        <w:ind w:firstLine="0"/>
-        <w:rPr>
-          <w:lang w:val="en-US"/>
-        </w:rPr>
+      </w:pPr>
+    </w:p>
+    <w:p>
+      <w:pPr>
+        <w:pStyle w:val="-"/>
+      </w:pPr>
+    </w:p>
+    <w:p>
+      <w:pPr>
+        <w:pStyle w:val="-"/>
+      </w:pPr>
+    </w:p>
+    <w:p>
+      <w:pPr>
+        <w:pStyle w:val="-"/>
+      </w:pPr>
+    </w:p>
+    <w:p>
+      <w:pPr>
+        <w:pStyle w:val="-"/>
+      </w:pPr>
+    </w:p>
+    <w:p>
+      <w:pPr>
+        <w:pStyle w:val="-"/>
+        <w:ind w:firstLine="0"/>
+      </w:pPr>
+    </w:p>
+    <w:p>
+      <w:pPr>
+        <w:pStyle w:val="-"/>
+        <w:ind w:firstLine="0"/>
       </w:pPr>
     </w:p>
     <w:p>
@@ -2005,6 +1993,9 @@
         <w:ind w:firstLine="0"/>
       </w:pPr>
       <w:r>
+        <w:rPr>
+          <w:noProof/>
+        </w:rPr>
         <w:lastRenderedPageBreak/>
         <w:drawing>
           <wp:inline distT="0" distB="0" distL="0" distR="0" wp14:anchorId="4FC6258E" wp14:editId="7F9B915F">
@@ -2055,6 +2046,9 @@
         <w:ind w:firstLine="0"/>
       </w:pPr>
       <w:r>
+        <w:rPr>
+          <w:noProof/>
+        </w:rPr>
         <w:drawing>
           <wp:inline distT="0" distB="0" distL="0" distR="0" wp14:anchorId="5FC8BF51" wp14:editId="56B8EB42">
             <wp:extent cx="5940425" cy="2794000"/>
@@ -2127,6 +2121,9 @@
         <w:ind w:firstLine="0"/>
       </w:pPr>
       <w:r>
+        <w:rPr>
+          <w:noProof/>
+        </w:rPr>
         <w:drawing>
           <wp:inline distT="0" distB="0" distL="0" distR="0" wp14:anchorId="01A4911C" wp14:editId="441B7C11">
             <wp:extent cx="5940425" cy="2482215"/>
@@ -2221,6 +2218,9 @@
         <w:ind w:firstLine="0"/>
       </w:pPr>
       <w:r>
+        <w:rPr>
+          <w:noProof/>
+        </w:rPr>
         <w:drawing>
           <wp:inline distT="0" distB="0" distL="0" distR="0" wp14:anchorId="4D6BD496" wp14:editId="3CC74B98">
             <wp:extent cx="5058481" cy="1600423"/>
@@ -2303,6 +2303,9 @@
         </w:rPr>
       </w:pPr>
       <w:r>
+        <w:rPr>
+          <w:noProof/>
+        </w:rPr>
         <w:lastRenderedPageBreak/>
         <w:drawing>
           <wp:inline distT="0" distB="0" distL="0" distR="0" wp14:anchorId="7EF78B01" wp14:editId="59F4F918">
@@ -2383,6 +2386,2336 @@
     <w:p>
       <w:pPr>
         <w:pStyle w:val="-"/>
+        <w:rPr>
+          <w:lang w:val="en-US"/>
+        </w:rPr>
+      </w:pPr>
+    </w:p>
+    <w:p>
+      <w:pPr>
+        <w:pStyle w:val="-"/>
+        <w:rPr>
+          <w:lang w:val="en-US"/>
+        </w:rPr>
+      </w:pPr>
+    </w:p>
+    <w:p>
+      <w:pPr>
+        <w:pStyle w:val="-"/>
+        <w:rPr>
+          <w:lang w:val="en-US"/>
+        </w:rPr>
+      </w:pPr>
+    </w:p>
+    <w:p>
+      <w:pPr>
+        <w:pStyle w:val="-"/>
+        <w:rPr>
+          <w:lang w:val="en-US"/>
+        </w:rPr>
+      </w:pPr>
+    </w:p>
+    <w:p>
+      <w:pPr>
+        <w:pStyle w:val="-"/>
+        <w:rPr>
+          <w:lang w:val="en-US"/>
+        </w:rPr>
+      </w:pPr>
+    </w:p>
+    <w:p>
+      <w:pPr>
+        <w:pStyle w:val="-"/>
+        <w:rPr>
+          <w:lang w:val="en-US"/>
+        </w:rPr>
+      </w:pPr>
+    </w:p>
+    <w:p>
+      <w:pPr>
+        <w:pStyle w:val="-"/>
+        <w:rPr>
+          <w:lang w:val="en-US"/>
+        </w:rPr>
+      </w:pPr>
+    </w:p>
+    <w:p>
+      <w:pPr>
+        <w:pStyle w:val="-"/>
+        <w:rPr>
+          <w:lang w:val="en-US"/>
+        </w:rPr>
+      </w:pPr>
+    </w:p>
+    <w:p>
+      <w:pPr>
+        <w:pStyle w:val="-"/>
+        <w:rPr>
+          <w:lang w:val="en-US"/>
+        </w:rPr>
+      </w:pPr>
+    </w:p>
+    <w:p>
+      <w:pPr>
+        <w:pStyle w:val="-"/>
+        <w:rPr>
+          <w:lang w:val="en-US"/>
+        </w:rPr>
+      </w:pPr>
+    </w:p>
+    <w:p>
+      <w:pPr>
+        <w:pStyle w:val="-"/>
+        <w:rPr>
+          <w:lang w:val="en-US"/>
+        </w:rPr>
+      </w:pPr>
+    </w:p>
+    <w:p>
+      <w:pPr>
+        <w:pStyle w:val="-"/>
+        <w:rPr>
+          <w:lang w:val="en-US"/>
+        </w:rPr>
+      </w:pPr>
+    </w:p>
+    <w:p>
+      <w:pPr>
+        <w:pStyle w:val="-"/>
+        <w:rPr>
+          <w:lang w:val="en-US"/>
+        </w:rPr>
+      </w:pPr>
+    </w:p>
+    <w:p>
+      <w:pPr>
+        <w:pStyle w:val="-"/>
+        <w:rPr>
+          <w:lang w:val="en-US"/>
+        </w:rPr>
+      </w:pPr>
+    </w:p>
+    <w:p>
+      <w:pPr>
+        <w:pStyle w:val="-"/>
+        <w:rPr>
+          <w:lang w:val="en-US"/>
+        </w:rPr>
+      </w:pPr>
+    </w:p>
+    <w:p>
+      <w:pPr>
+        <w:pStyle w:val="-"/>
+        <w:rPr>
+          <w:lang w:val="en-US"/>
+        </w:rPr>
+      </w:pPr>
+    </w:p>
+    <w:p>
+      <w:pPr>
+        <w:pStyle w:val="-"/>
+        <w:rPr>
+          <w:lang w:val="en-US"/>
+        </w:rPr>
+      </w:pPr>
+    </w:p>
+    <w:p>
+      <w:pPr>
+        <w:pStyle w:val="-"/>
+        <w:rPr>
+          <w:lang w:val="en-US"/>
+        </w:rPr>
+      </w:pPr>
+    </w:p>
+    <w:p>
+      <w:pPr>
+        <w:pStyle w:val="-"/>
+        <w:rPr>
+          <w:lang w:val="en-US"/>
+        </w:rPr>
+      </w:pPr>
+    </w:p>
+    <w:p>
+      <w:pPr>
+        <w:pStyle w:val="-"/>
+        <w:rPr>
+          <w:lang w:val="en-US"/>
+        </w:rPr>
+      </w:pPr>
+    </w:p>
+    <w:p>
+      <w:pPr>
+        <w:pStyle w:val="-"/>
+        <w:rPr>
+          <w:lang w:val="en-US"/>
+        </w:rPr>
+      </w:pPr>
+    </w:p>
+    <w:p>
+      <w:pPr>
+        <w:pStyle w:val="-"/>
+        <w:rPr>
+          <w:lang w:val="en-US"/>
+        </w:rPr>
+      </w:pPr>
+    </w:p>
+    <w:p>
+      <w:pPr>
+        <w:pStyle w:val="-"/>
+        <w:rPr>
+          <w:lang w:val="en-US"/>
+        </w:rPr>
+      </w:pPr>
+    </w:p>
+    <w:p>
+      <w:pPr>
+        <w:pStyle w:val="-"/>
+        <w:rPr>
+          <w:lang w:val="en-US"/>
+        </w:rPr>
+      </w:pPr>
+    </w:p>
+    <w:p>
+      <w:pPr>
+        <w:pStyle w:val="-"/>
+        <w:rPr>
+          <w:lang w:val="en-US"/>
+        </w:rPr>
+      </w:pPr>
+    </w:p>
+    <w:p>
+      <w:pPr>
+        <w:pStyle w:val="-"/>
+        <w:rPr>
+          <w:lang w:val="en-US"/>
+        </w:rPr>
+      </w:pPr>
+    </w:p>
+    <w:p>
+      <w:pPr>
+        <w:pStyle w:val="-"/>
+        <w:rPr>
+          <w:lang w:val="en-US"/>
+        </w:rPr>
+      </w:pPr>
+    </w:p>
+    <w:p>
+      <w:pPr>
+        <w:pStyle w:val="-"/>
+        <w:rPr>
+          <w:lang w:val="en-US"/>
+        </w:rPr>
+      </w:pPr>
+    </w:p>
+    <w:p>
+      <w:pPr>
+        <w:pStyle w:val="-"/>
+        <w:rPr>
+          <w:lang w:val="en-US"/>
+        </w:rPr>
+      </w:pPr>
+    </w:p>
+    <w:p>
+      <w:pPr>
+        <w:pStyle w:val="-"/>
+        <w:rPr>
+          <w:lang w:val="en-US"/>
+        </w:rPr>
+      </w:pPr>
+    </w:p>
+    <w:p>
+      <w:pPr>
+        <w:pStyle w:val="-"/>
+        <w:ind w:firstLine="0"/>
+        <w:rPr>
+          <w:lang w:val="en-US"/>
+        </w:rPr>
+      </w:pPr>
+      <w:r>
+        <w:rPr>
+          <w:lang w:val="en-US"/>
+        </w:rPr>
+        <w:lastRenderedPageBreak/>
+        <w:drawing>
+          <wp:inline distT="0" distB="0" distL="0" distR="0" wp14:anchorId="713DA130" wp14:editId="0157B526">
+            <wp:extent cx="5940425" cy="4070985"/>
+            <wp:effectExtent l="0" t="0" r="3175" b="5715"/>
+            <wp:docPr id="1294931019" name="Рисунок 1"/>
+            <wp:cNvGraphicFramePr>
+              <a:graphicFrameLocks xmlns:a="http://schemas.openxmlformats.org/drawingml/2006/main" noChangeAspect="1"/>
+            </wp:cNvGraphicFramePr>
+            <a:graphic xmlns:a="http://schemas.openxmlformats.org/drawingml/2006/main">
+              <a:graphicData uri="http://schemas.openxmlformats.org/drawingml/2006/picture">
+                <pic:pic xmlns:pic="http://schemas.openxmlformats.org/drawingml/2006/picture">
+                  <pic:nvPicPr>
+                    <pic:cNvPr id="1294931019" name=""/>
+                    <pic:cNvPicPr/>
+                  </pic:nvPicPr>
+                  <pic:blipFill>
+                    <a:blip r:embed="rId24"/>
+                    <a:stretch>
+                      <a:fillRect/>
+                    </a:stretch>
+                  </pic:blipFill>
+                  <pic:spPr>
+                    <a:xfrm>
+                      <a:off x="0" y="0"/>
+                      <a:ext cx="5940425" cy="4070985"/>
+                    </a:xfrm>
+                    <a:prstGeom prst="rect">
+                      <a:avLst/>
+                    </a:prstGeom>
+                  </pic:spPr>
+                </pic:pic>
+              </a:graphicData>
+            </a:graphic>
+          </wp:inline>
+        </w:drawing>
+      </w:r>
+    </w:p>
+    <w:p>
+      <w:pPr>
+        <w:pStyle w:val="-"/>
+        <w:ind w:firstLine="0"/>
+        <w:rPr>
+          <w:lang w:val="en-US"/>
+        </w:rPr>
+      </w:pPr>
+    </w:p>
+    <w:p>
+      <w:pPr>
+        <w:pStyle w:val="-"/>
+        <w:ind w:firstLine="0"/>
+        <w:rPr>
+          <w:lang w:val="en-US"/>
+        </w:rPr>
+      </w:pPr>
+    </w:p>
+    <w:p>
+      <w:pPr>
+        <w:pStyle w:val="-"/>
+        <w:ind w:firstLine="0"/>
+        <w:rPr>
+          <w:lang w:val="en-US"/>
+        </w:rPr>
+      </w:pPr>
+    </w:p>
+    <w:p>
+      <w:pPr>
+        <w:pStyle w:val="-"/>
+        <w:ind w:firstLine="0"/>
+        <w:rPr>
+          <w:lang w:val="en-US"/>
+        </w:rPr>
+      </w:pPr>
+      <w:r>
+        <w:rPr>
+          <w:lang w:val="en-US"/>
+        </w:rPr>
+        <w:drawing>
+          <wp:inline distT="0" distB="0" distL="0" distR="0" wp14:anchorId="5C4A2995" wp14:editId="242A18D0">
+            <wp:extent cx="4439270" cy="3038899"/>
+            <wp:effectExtent l="0" t="0" r="0" b="9525"/>
+            <wp:docPr id="2072206426" name="Рисунок 1"/>
+            <wp:cNvGraphicFramePr>
+              <a:graphicFrameLocks xmlns:a="http://schemas.openxmlformats.org/drawingml/2006/main" noChangeAspect="1"/>
+            </wp:cNvGraphicFramePr>
+            <a:graphic xmlns:a="http://schemas.openxmlformats.org/drawingml/2006/main">
+              <a:graphicData uri="http://schemas.openxmlformats.org/drawingml/2006/picture">
+                <pic:pic xmlns:pic="http://schemas.openxmlformats.org/drawingml/2006/picture">
+                  <pic:nvPicPr>
+                    <pic:cNvPr id="2072206426" name=""/>
+                    <pic:cNvPicPr/>
+                  </pic:nvPicPr>
+                  <pic:blipFill>
+                    <a:blip r:embed="rId25"/>
+                    <a:stretch>
+                      <a:fillRect/>
+                    </a:stretch>
+                  </pic:blipFill>
+                  <pic:spPr>
+                    <a:xfrm>
+                      <a:off x="0" y="0"/>
+                      <a:ext cx="4439270" cy="3038899"/>
+                    </a:xfrm>
+                    <a:prstGeom prst="rect">
+                      <a:avLst/>
+                    </a:prstGeom>
+                  </pic:spPr>
+                </pic:pic>
+              </a:graphicData>
+            </a:graphic>
+          </wp:inline>
+        </w:drawing>
+      </w:r>
+    </w:p>
+    <w:p>
+      <w:pPr>
+        <w:pStyle w:val="-"/>
+        <w:ind w:firstLine="0"/>
+        <w:rPr>
+          <w:lang w:val="en-US"/>
+        </w:rPr>
+      </w:pPr>
+    </w:p>
+    <w:p>
+      <w:pPr>
+        <w:pStyle w:val="-"/>
+        <w:ind w:firstLine="0"/>
+        <w:rPr>
+          <w:lang w:val="en-US"/>
+        </w:rPr>
+      </w:pPr>
+    </w:p>
+    <w:p>
+      <w:pPr>
+        <w:pStyle w:val="-"/>
+        <w:ind w:firstLine="0"/>
+        <w:rPr>
+          <w:lang w:val="en-US"/>
+        </w:rPr>
+      </w:pPr>
+    </w:p>
+    <w:p>
+      <w:pPr>
+        <w:pStyle w:val="-"/>
+        <w:ind w:firstLine="0"/>
+        <w:rPr>
+          <w:lang w:val="en-US"/>
+        </w:rPr>
+      </w:pPr>
+      <w:r>
+        <w:rPr>
+          <w:lang w:val="en-US"/>
+        </w:rPr>
+        <w:lastRenderedPageBreak/>
+        <w:drawing>
+          <wp:inline distT="0" distB="0" distL="0" distR="0" wp14:anchorId="5D6F4248" wp14:editId="14549D15">
+            <wp:extent cx="5940425" cy="1977390"/>
+            <wp:effectExtent l="0" t="0" r="3175" b="3810"/>
+            <wp:docPr id="3181519" name="Рисунок 1"/>
+            <wp:cNvGraphicFramePr>
+              <a:graphicFrameLocks xmlns:a="http://schemas.openxmlformats.org/drawingml/2006/main" noChangeAspect="1"/>
+            </wp:cNvGraphicFramePr>
+            <a:graphic xmlns:a="http://schemas.openxmlformats.org/drawingml/2006/main">
+              <a:graphicData uri="http://schemas.openxmlformats.org/drawingml/2006/picture">
+                <pic:pic xmlns:pic="http://schemas.openxmlformats.org/drawingml/2006/picture">
+                  <pic:nvPicPr>
+                    <pic:cNvPr id="3181519" name=""/>
+                    <pic:cNvPicPr/>
+                  </pic:nvPicPr>
+                  <pic:blipFill>
+                    <a:blip r:embed="rId26"/>
+                    <a:stretch>
+                      <a:fillRect/>
+                    </a:stretch>
+                  </pic:blipFill>
+                  <pic:spPr>
+                    <a:xfrm>
+                      <a:off x="0" y="0"/>
+                      <a:ext cx="5940425" cy="1977390"/>
+                    </a:xfrm>
+                    <a:prstGeom prst="rect">
+                      <a:avLst/>
+                    </a:prstGeom>
+                  </pic:spPr>
+                </pic:pic>
+              </a:graphicData>
+            </a:graphic>
+          </wp:inline>
+        </w:drawing>
+      </w:r>
+    </w:p>
+    <w:p>
+      <w:pPr>
+        <w:pStyle w:val="-"/>
+        <w:ind w:firstLine="0"/>
+        <w:rPr>
+          <w:lang w:val="en-US"/>
+        </w:rPr>
+      </w:pPr>
+    </w:p>
+    <w:p>
+      <w:pPr>
+        <w:pStyle w:val="-"/>
+        <w:ind w:firstLine="0"/>
+        <w:rPr>
+          <w:lang w:val="en-US"/>
+        </w:rPr>
+      </w:pPr>
+    </w:p>
+    <w:p>
+      <w:pPr>
+        <w:pStyle w:val="-"/>
+        <w:ind w:firstLine="0"/>
+        <w:rPr>
+          <w:lang w:val="en-US"/>
+        </w:rPr>
+      </w:pPr>
+      <w:r>
+        <w:rPr>
+          <w:lang w:val="en-US"/>
+        </w:rPr>
+        <w:drawing>
+          <wp:inline distT="0" distB="0" distL="0" distR="0" wp14:anchorId="163BEF60" wp14:editId="21E5B5F8">
+            <wp:extent cx="5940425" cy="4058920"/>
+            <wp:effectExtent l="0" t="0" r="3175" b="0"/>
+            <wp:docPr id="1646423855" name="Рисунок 1"/>
+            <wp:cNvGraphicFramePr>
+              <a:graphicFrameLocks xmlns:a="http://schemas.openxmlformats.org/drawingml/2006/main" noChangeAspect="1"/>
+            </wp:cNvGraphicFramePr>
+            <a:graphic xmlns:a="http://schemas.openxmlformats.org/drawingml/2006/main">
+              <a:graphicData uri="http://schemas.openxmlformats.org/drawingml/2006/picture">
+                <pic:pic xmlns:pic="http://schemas.openxmlformats.org/drawingml/2006/picture">
+                  <pic:nvPicPr>
+                    <pic:cNvPr id="1646423855" name=""/>
+                    <pic:cNvPicPr/>
+                  </pic:nvPicPr>
+                  <pic:blipFill>
+                    <a:blip r:embed="rId27"/>
+                    <a:stretch>
+                      <a:fillRect/>
+                    </a:stretch>
+                  </pic:blipFill>
+                  <pic:spPr>
+                    <a:xfrm>
+                      <a:off x="0" y="0"/>
+                      <a:ext cx="5940425" cy="4058920"/>
+                    </a:xfrm>
+                    <a:prstGeom prst="rect">
+                      <a:avLst/>
+                    </a:prstGeom>
+                  </pic:spPr>
+                </pic:pic>
+              </a:graphicData>
+            </a:graphic>
+          </wp:inline>
+        </w:drawing>
+      </w:r>
+    </w:p>
+    <w:p>
+      <w:pPr>
+        <w:pStyle w:val="-"/>
+        <w:ind w:firstLine="0"/>
+        <w:rPr>
+          <w:lang w:val="en-US"/>
+        </w:rPr>
+      </w:pPr>
+    </w:p>
+    <w:p>
+      <w:pPr>
+        <w:pStyle w:val="-"/>
+        <w:ind w:firstLine="0"/>
+        <w:rPr>
+          <w:lang w:val="en-US"/>
+        </w:rPr>
+      </w:pPr>
+    </w:p>
+    <w:p>
+      <w:pPr>
+        <w:pStyle w:val="-"/>
+        <w:ind w:firstLine="0"/>
+        <w:rPr>
+          <w:lang w:val="en-US"/>
+        </w:rPr>
+      </w:pPr>
+      <w:r>
+        <w:rPr>
+          <w:lang w:val="en-US"/>
+        </w:rPr>
+        <w:lastRenderedPageBreak/>
+        <w:drawing>
+          <wp:inline distT="0" distB="0" distL="0" distR="0" wp14:anchorId="088711B4" wp14:editId="40BED30C">
+            <wp:extent cx="4163006" cy="3610479"/>
+            <wp:effectExtent l="0" t="0" r="9525" b="9525"/>
+            <wp:docPr id="994340133" name="Рисунок 1"/>
+            <wp:cNvGraphicFramePr>
+              <a:graphicFrameLocks xmlns:a="http://schemas.openxmlformats.org/drawingml/2006/main" noChangeAspect="1"/>
+            </wp:cNvGraphicFramePr>
+            <a:graphic xmlns:a="http://schemas.openxmlformats.org/drawingml/2006/main">
+              <a:graphicData uri="http://schemas.openxmlformats.org/drawingml/2006/picture">
+                <pic:pic xmlns:pic="http://schemas.openxmlformats.org/drawingml/2006/picture">
+                  <pic:nvPicPr>
+                    <pic:cNvPr id="994340133" name=""/>
+                    <pic:cNvPicPr/>
+                  </pic:nvPicPr>
+                  <pic:blipFill>
+                    <a:blip r:embed="rId28"/>
+                    <a:stretch>
+                      <a:fillRect/>
+                    </a:stretch>
+                  </pic:blipFill>
+                  <pic:spPr>
+                    <a:xfrm>
+                      <a:off x="0" y="0"/>
+                      <a:ext cx="4163006" cy="3610479"/>
+                    </a:xfrm>
+                    <a:prstGeom prst="rect">
+                      <a:avLst/>
+                    </a:prstGeom>
+                  </pic:spPr>
+                </pic:pic>
+              </a:graphicData>
+            </a:graphic>
+          </wp:inline>
+        </w:drawing>
+      </w:r>
+    </w:p>
+    <w:p>
+      <w:pPr>
+        <w:pStyle w:val="-"/>
+        <w:ind w:firstLine="0"/>
+        <w:rPr>
+          <w:lang w:val="en-US"/>
+        </w:rPr>
+      </w:pPr>
+    </w:p>
+    <w:p>
+      <w:pPr>
+        <w:pStyle w:val="-"/>
+        <w:ind w:firstLine="0"/>
+        <w:rPr>
+          <w:lang w:val="en-US"/>
+        </w:rPr>
+      </w:pPr>
+    </w:p>
+    <w:p>
+      <w:pPr>
+        <w:pStyle w:val="-"/>
+        <w:ind w:firstLine="0"/>
+        <w:rPr>
+          <w:lang w:val="en-US"/>
+        </w:rPr>
+      </w:pPr>
+      <w:r>
+        <w:rPr>
+          <w:lang w:val="en-US"/>
+        </w:rPr>
+        <w:drawing>
+          <wp:inline distT="0" distB="0" distL="0" distR="0" wp14:anchorId="4B85B592" wp14:editId="63938564">
+            <wp:extent cx="3648584" cy="3324689"/>
+            <wp:effectExtent l="0" t="0" r="9525" b="9525"/>
+            <wp:docPr id="238407558" name="Рисунок 1"/>
+            <wp:cNvGraphicFramePr>
+              <a:graphicFrameLocks xmlns:a="http://schemas.openxmlformats.org/drawingml/2006/main" noChangeAspect="1"/>
+            </wp:cNvGraphicFramePr>
+            <a:graphic xmlns:a="http://schemas.openxmlformats.org/drawingml/2006/main">
+              <a:graphicData uri="http://schemas.openxmlformats.org/drawingml/2006/picture">
+                <pic:pic xmlns:pic="http://schemas.openxmlformats.org/drawingml/2006/picture">
+                  <pic:nvPicPr>
+                    <pic:cNvPr id="238407558" name=""/>
+                    <pic:cNvPicPr/>
+                  </pic:nvPicPr>
+                  <pic:blipFill>
+                    <a:blip r:embed="rId29"/>
+                    <a:stretch>
+                      <a:fillRect/>
+                    </a:stretch>
+                  </pic:blipFill>
+                  <pic:spPr>
+                    <a:xfrm>
+                      <a:off x="0" y="0"/>
+                      <a:ext cx="3648584" cy="3324689"/>
+                    </a:xfrm>
+                    <a:prstGeom prst="rect">
+                      <a:avLst/>
+                    </a:prstGeom>
+                  </pic:spPr>
+                </pic:pic>
+              </a:graphicData>
+            </a:graphic>
+          </wp:inline>
+        </w:drawing>
+      </w:r>
+    </w:p>
+    <w:p>
+      <w:pPr>
+        <w:pStyle w:val="-"/>
+        <w:ind w:firstLine="0"/>
+        <w:rPr>
+          <w:lang w:val="en-US"/>
+        </w:rPr>
+      </w:pPr>
+    </w:p>
+    <w:p>
+      <w:pPr>
+        <w:pStyle w:val="-"/>
+        <w:ind w:firstLine="0"/>
+        <w:rPr>
+          <w:lang w:val="en-US"/>
+        </w:rPr>
+      </w:pPr>
+    </w:p>
+    <w:p>
+      <w:pPr>
+        <w:pStyle w:val="-"/>
+        <w:ind w:firstLine="0"/>
+      </w:pPr>
+      <w:r>
+        <w:lastRenderedPageBreak/>
+        <w:drawing>
+          <wp:inline distT="0" distB="0" distL="0" distR="0" wp14:anchorId="040E38EA" wp14:editId="5A9206FE">
+            <wp:extent cx="5940425" cy="3557905"/>
+            <wp:effectExtent l="0" t="0" r="3175" b="4445"/>
+            <wp:docPr id="1694795695" name="Рисунок 1"/>
+            <wp:cNvGraphicFramePr>
+              <a:graphicFrameLocks xmlns:a="http://schemas.openxmlformats.org/drawingml/2006/main" noChangeAspect="1"/>
+            </wp:cNvGraphicFramePr>
+            <a:graphic xmlns:a="http://schemas.openxmlformats.org/drawingml/2006/main">
+              <a:graphicData uri="http://schemas.openxmlformats.org/drawingml/2006/picture">
+                <pic:pic xmlns:pic="http://schemas.openxmlformats.org/drawingml/2006/picture">
+                  <pic:nvPicPr>
+                    <pic:cNvPr id="1694795695" name=""/>
+                    <pic:cNvPicPr/>
+                  </pic:nvPicPr>
+                  <pic:blipFill>
+                    <a:blip r:embed="rId30"/>
+                    <a:stretch>
+                      <a:fillRect/>
+                    </a:stretch>
+                  </pic:blipFill>
+                  <pic:spPr>
+                    <a:xfrm>
+                      <a:off x="0" y="0"/>
+                      <a:ext cx="5940425" cy="3557905"/>
+                    </a:xfrm>
+                    <a:prstGeom prst="rect">
+                      <a:avLst/>
+                    </a:prstGeom>
+                  </pic:spPr>
+                </pic:pic>
+              </a:graphicData>
+            </a:graphic>
+          </wp:inline>
+        </w:drawing>
+      </w:r>
+    </w:p>
+    <w:p>
+      <w:pPr>
+        <w:pStyle w:val="-"/>
+        <w:ind w:firstLine="0"/>
+      </w:pPr>
+    </w:p>
+    <w:p>
+      <w:pPr>
+        <w:pStyle w:val="-"/>
+        <w:ind w:firstLine="0"/>
+      </w:pPr>
+      <w:r>
+        <w:drawing>
+          <wp:inline distT="0" distB="0" distL="0" distR="0" wp14:anchorId="12DE9DE4" wp14:editId="04B4F71B">
+            <wp:extent cx="5940425" cy="3557905"/>
+            <wp:effectExtent l="0" t="0" r="3175" b="4445"/>
+            <wp:docPr id="836078274" name="Рисунок 1"/>
+            <wp:cNvGraphicFramePr>
+              <a:graphicFrameLocks xmlns:a="http://schemas.openxmlformats.org/drawingml/2006/main" noChangeAspect="1"/>
+            </wp:cNvGraphicFramePr>
+            <a:graphic xmlns:a="http://schemas.openxmlformats.org/drawingml/2006/main">
+              <a:graphicData uri="http://schemas.openxmlformats.org/drawingml/2006/picture">
+                <pic:pic xmlns:pic="http://schemas.openxmlformats.org/drawingml/2006/picture">
+                  <pic:nvPicPr>
+                    <pic:cNvPr id="836078274" name=""/>
+                    <pic:cNvPicPr/>
+                  </pic:nvPicPr>
+                  <pic:blipFill>
+                    <a:blip r:embed="rId31"/>
+                    <a:stretch>
+                      <a:fillRect/>
+                    </a:stretch>
+                  </pic:blipFill>
+                  <pic:spPr>
+                    <a:xfrm>
+                      <a:off x="0" y="0"/>
+                      <a:ext cx="5940425" cy="3557905"/>
+                    </a:xfrm>
+                    <a:prstGeom prst="rect">
+                      <a:avLst/>
+                    </a:prstGeom>
+                  </pic:spPr>
+                </pic:pic>
+              </a:graphicData>
+            </a:graphic>
+          </wp:inline>
+        </w:drawing>
+      </w:r>
+    </w:p>
+    <w:p>
+      <w:pPr>
+        <w:pStyle w:val="-"/>
+        <w:ind w:firstLine="0"/>
+      </w:pPr>
+    </w:p>
+    <w:p>
+      <w:pPr>
+        <w:pStyle w:val="-"/>
+        <w:ind w:firstLine="0"/>
+      </w:pPr>
+    </w:p>
+    <w:p>
+      <w:pPr>
+        <w:pStyle w:val="-"/>
+        <w:ind w:firstLine="0"/>
+        <w:rPr>
+          <w:lang w:val="en-US"/>
+        </w:rPr>
+      </w:pPr>
+      <w:r>
+        <w:t xml:space="preserve">Настройка проекта </w:t>
+      </w:r>
+      <w:r>
+        <w:rPr>
+          <w:lang w:val="en-US"/>
+        </w:rPr>
+        <w:t>main</w:t>
+      </w:r>
+    </w:p>
+    <w:p>
+      <w:pPr>
+        <w:pStyle w:val="-"/>
+        <w:ind w:firstLine="0"/>
+        <w:rPr>
+          <w:lang w:val="en-US"/>
+        </w:rPr>
+      </w:pPr>
+    </w:p>
+    <w:p>
+      <w:pPr>
+        <w:pStyle w:val="-"/>
+        <w:ind w:firstLine="0"/>
+        <w:rPr>
+          <w:lang w:val="en-US"/>
+        </w:rPr>
+      </w:pPr>
+    </w:p>
+    <w:p>
+      <w:pPr>
+        <w:pStyle w:val="-"/>
+        <w:ind w:firstLine="0"/>
+        <w:rPr>
+          <w:lang w:val="en-US"/>
+        </w:rPr>
+      </w:pPr>
+      <w:r>
+        <w:rPr>
+          <w:lang w:val="en-US"/>
+        </w:rPr>
+        <w:lastRenderedPageBreak/>
+        <w:drawing>
+          <wp:inline distT="0" distB="0" distL="0" distR="0" wp14:anchorId="2E16A1DD" wp14:editId="4094D60C">
+            <wp:extent cx="5940425" cy="3552825"/>
+            <wp:effectExtent l="0" t="0" r="3175" b="9525"/>
+            <wp:docPr id="1774820717" name="Рисунок 1"/>
+            <wp:cNvGraphicFramePr>
+              <a:graphicFrameLocks xmlns:a="http://schemas.openxmlformats.org/drawingml/2006/main" noChangeAspect="1"/>
+            </wp:cNvGraphicFramePr>
+            <a:graphic xmlns:a="http://schemas.openxmlformats.org/drawingml/2006/main">
+              <a:graphicData uri="http://schemas.openxmlformats.org/drawingml/2006/picture">
+                <pic:pic xmlns:pic="http://schemas.openxmlformats.org/drawingml/2006/picture">
+                  <pic:nvPicPr>
+                    <pic:cNvPr id="1774820717" name=""/>
+                    <pic:cNvPicPr/>
+                  </pic:nvPicPr>
+                  <pic:blipFill>
+                    <a:blip r:embed="rId32"/>
+                    <a:stretch>
+                      <a:fillRect/>
+                    </a:stretch>
+                  </pic:blipFill>
+                  <pic:spPr>
+                    <a:xfrm>
+                      <a:off x="0" y="0"/>
+                      <a:ext cx="5940425" cy="3552825"/>
+                    </a:xfrm>
+                    <a:prstGeom prst="rect">
+                      <a:avLst/>
+                    </a:prstGeom>
+                  </pic:spPr>
+                </pic:pic>
+              </a:graphicData>
+            </a:graphic>
+          </wp:inline>
+        </w:drawing>
+      </w:r>
+    </w:p>
+    <w:p>
+      <w:pPr>
+        <w:pStyle w:val="-"/>
+        <w:ind w:firstLine="0"/>
+        <w:rPr>
+          <w:lang w:val="en-US"/>
+        </w:rPr>
+      </w:pPr>
+    </w:p>
+    <w:p>
+      <w:pPr>
+        <w:pStyle w:val="-"/>
+        <w:ind w:firstLine="0"/>
+        <w:rPr>
+          <w:lang w:val="en-US"/>
+        </w:rPr>
+      </w:pPr>
+    </w:p>
+    <w:p>
+      <w:pPr>
+        <w:pStyle w:val="-"/>
+        <w:ind w:firstLine="0"/>
+        <w:rPr>
+          <w:lang w:val="en-US"/>
+        </w:rPr>
+      </w:pPr>
+      <w:r>
+        <w:rPr>
+          <w:lang w:val="en-US"/>
+        </w:rPr>
+        <w:drawing>
+          <wp:inline distT="0" distB="0" distL="0" distR="0" wp14:anchorId="735503F3" wp14:editId="19A500DF">
+            <wp:extent cx="5940425" cy="3552825"/>
+            <wp:effectExtent l="0" t="0" r="3175" b="9525"/>
+            <wp:docPr id="1233960478" name="Рисунок 1"/>
+            <wp:cNvGraphicFramePr>
+              <a:graphicFrameLocks xmlns:a="http://schemas.openxmlformats.org/drawingml/2006/main" noChangeAspect="1"/>
+            </wp:cNvGraphicFramePr>
+            <a:graphic xmlns:a="http://schemas.openxmlformats.org/drawingml/2006/main">
+              <a:graphicData uri="http://schemas.openxmlformats.org/drawingml/2006/picture">
+                <pic:pic xmlns:pic="http://schemas.openxmlformats.org/drawingml/2006/picture">
+                  <pic:nvPicPr>
+                    <pic:cNvPr id="1233960478" name=""/>
+                    <pic:cNvPicPr/>
+                  </pic:nvPicPr>
+                  <pic:blipFill>
+                    <a:blip r:embed="rId33"/>
+                    <a:stretch>
+                      <a:fillRect/>
+                    </a:stretch>
+                  </pic:blipFill>
+                  <pic:spPr>
+                    <a:xfrm>
+                      <a:off x="0" y="0"/>
+                      <a:ext cx="5940425" cy="3552825"/>
+                    </a:xfrm>
+                    <a:prstGeom prst="rect">
+                      <a:avLst/>
+                    </a:prstGeom>
+                  </pic:spPr>
+                </pic:pic>
+              </a:graphicData>
+            </a:graphic>
+          </wp:inline>
+        </w:drawing>
+      </w:r>
+    </w:p>
+    <w:p>
+      <w:pPr>
+        <w:pStyle w:val="-"/>
+        <w:ind w:firstLine="0"/>
+        <w:rPr>
+          <w:lang w:val="en-US"/>
+        </w:rPr>
+      </w:pPr>
+    </w:p>
+    <w:p>
+      <w:pPr>
+        <w:pStyle w:val="-"/>
+        <w:ind w:firstLine="0"/>
+        <w:rPr>
+          <w:lang w:val="en-US"/>
+        </w:rPr>
+      </w:pPr>
+    </w:p>
+    <w:p>
+      <w:pPr>
+        <w:pStyle w:val="-"/>
+        <w:ind w:firstLine="0"/>
+        <w:rPr>
+          <w:lang w:val="en-US"/>
+        </w:rPr>
+      </w:pPr>
+    </w:p>
+    <w:p>
+      <w:pPr>
+        <w:pStyle w:val="-"/>
+        <w:ind w:firstLine="0"/>
+        <w:rPr>
+          <w:lang w:val="en-US"/>
+        </w:rPr>
+      </w:pPr>
+      <w:r>
+        <w:rPr>
+          <w:lang w:val="en-US"/>
+        </w:rPr>
+        <w:lastRenderedPageBreak/>
+        <w:drawing>
+          <wp:inline distT="0" distB="0" distL="0" distR="0" wp14:anchorId="530C8A71" wp14:editId="40C37DD3">
+            <wp:extent cx="5940425" cy="7052310"/>
+            <wp:effectExtent l="0" t="0" r="3175" b="0"/>
+            <wp:docPr id="1915939950" name="Рисунок 1"/>
+            <wp:cNvGraphicFramePr>
+              <a:graphicFrameLocks xmlns:a="http://schemas.openxmlformats.org/drawingml/2006/main" noChangeAspect="1"/>
+            </wp:cNvGraphicFramePr>
+            <a:graphic xmlns:a="http://schemas.openxmlformats.org/drawingml/2006/main">
+              <a:graphicData uri="http://schemas.openxmlformats.org/drawingml/2006/picture">
+                <pic:pic xmlns:pic="http://schemas.openxmlformats.org/drawingml/2006/picture">
+                  <pic:nvPicPr>
+                    <pic:cNvPr id="1915939950" name=""/>
+                    <pic:cNvPicPr/>
+                  </pic:nvPicPr>
+                  <pic:blipFill>
+                    <a:blip r:embed="rId34"/>
+                    <a:stretch>
+                      <a:fillRect/>
+                    </a:stretch>
+                  </pic:blipFill>
+                  <pic:spPr>
+                    <a:xfrm>
+                      <a:off x="0" y="0"/>
+                      <a:ext cx="5940425" cy="7052310"/>
+                    </a:xfrm>
+                    <a:prstGeom prst="rect">
+                      <a:avLst/>
+                    </a:prstGeom>
+                  </pic:spPr>
+                </pic:pic>
+              </a:graphicData>
+            </a:graphic>
+          </wp:inline>
+        </w:drawing>
+      </w:r>
+    </w:p>
+    <w:p>
+      <w:pPr>
+        <w:pStyle w:val="-"/>
+        <w:ind w:firstLine="0"/>
+        <w:rPr>
+          <w:lang w:val="en-US"/>
+        </w:rPr>
+      </w:pPr>
+      <w:r>
+        <w:rPr>
+          <w:lang w:val="en-US"/>
+        </w:rPr>
+        <w:lastRenderedPageBreak/>
+        <w:drawing>
+          <wp:inline distT="0" distB="0" distL="0" distR="0" wp14:anchorId="028DA8EC" wp14:editId="0F4E96BA">
+            <wp:extent cx="5940425" cy="3552825"/>
+            <wp:effectExtent l="0" t="0" r="3175" b="9525"/>
+            <wp:docPr id="1014782972" name="Рисунок 1"/>
+            <wp:cNvGraphicFramePr>
+              <a:graphicFrameLocks xmlns:a="http://schemas.openxmlformats.org/drawingml/2006/main" noChangeAspect="1"/>
+            </wp:cNvGraphicFramePr>
+            <a:graphic xmlns:a="http://schemas.openxmlformats.org/drawingml/2006/main">
+              <a:graphicData uri="http://schemas.openxmlformats.org/drawingml/2006/picture">
+                <pic:pic xmlns:pic="http://schemas.openxmlformats.org/drawingml/2006/picture">
+                  <pic:nvPicPr>
+                    <pic:cNvPr id="1014782972" name=""/>
+                    <pic:cNvPicPr/>
+                  </pic:nvPicPr>
+                  <pic:blipFill>
+                    <a:blip r:embed="rId35"/>
+                    <a:stretch>
+                      <a:fillRect/>
+                    </a:stretch>
+                  </pic:blipFill>
+                  <pic:spPr>
+                    <a:xfrm>
+                      <a:off x="0" y="0"/>
+                      <a:ext cx="5940425" cy="3552825"/>
+                    </a:xfrm>
+                    <a:prstGeom prst="rect">
+                      <a:avLst/>
+                    </a:prstGeom>
+                  </pic:spPr>
+                </pic:pic>
+              </a:graphicData>
+            </a:graphic>
+          </wp:inline>
+        </w:drawing>
+      </w:r>
+    </w:p>
+    <w:p>
+      <w:pPr>
+        <w:pStyle w:val="-"/>
+        <w:ind w:firstLine="0"/>
+        <w:rPr>
+          <w:lang w:val="en-US"/>
+        </w:rPr>
+      </w:pPr>
+    </w:p>
+    <w:p>
+      <w:pPr>
+        <w:pStyle w:val="-"/>
+        <w:ind w:firstLine="0"/>
+        <w:rPr>
+          <w:lang w:val="en-US"/>
+        </w:rPr>
+      </w:pPr>
+    </w:p>
+    <w:p>
+      <w:pPr>
+        <w:pStyle w:val="-"/>
+        <w:ind w:firstLine="0"/>
+      </w:pPr>
+      <w:r>
+        <w:t>Все ошибки были исправлены, решение видит все подключенные файлы, всё настроено правильно.</w:t>
+      </w:r>
+    </w:p>
+    <w:p>
+      <w:pPr>
+        <w:pStyle w:val="-"/>
+        <w:ind w:firstLine="0"/>
+        <w:rPr>
+          <w:lang w:val="en-US"/>
+        </w:rPr>
+      </w:pPr>
+      <w:r>
+        <w:rPr>
+          <w:lang w:val="en-US"/>
+        </w:rPr>
+        <w:drawing>
+          <wp:inline distT="0" distB="0" distL="0" distR="0" wp14:anchorId="60420C1B" wp14:editId="61B9D5D4">
+            <wp:extent cx="5940425" cy="1363345"/>
+            <wp:effectExtent l="0" t="0" r="3175" b="8255"/>
+            <wp:docPr id="566704572" name="Рисунок 1"/>
+            <wp:cNvGraphicFramePr>
+              <a:graphicFrameLocks xmlns:a="http://schemas.openxmlformats.org/drawingml/2006/main" noChangeAspect="1"/>
+            </wp:cNvGraphicFramePr>
+            <a:graphic xmlns:a="http://schemas.openxmlformats.org/drawingml/2006/main">
+              <a:graphicData uri="http://schemas.openxmlformats.org/drawingml/2006/picture">
+                <pic:pic xmlns:pic="http://schemas.openxmlformats.org/drawingml/2006/picture">
+                  <pic:nvPicPr>
+                    <pic:cNvPr id="566704572" name=""/>
+                    <pic:cNvPicPr/>
+                  </pic:nvPicPr>
+                  <pic:blipFill>
+                    <a:blip r:embed="rId36"/>
+                    <a:stretch>
+                      <a:fillRect/>
+                    </a:stretch>
+                  </pic:blipFill>
+                  <pic:spPr>
+                    <a:xfrm>
+                      <a:off x="0" y="0"/>
+                      <a:ext cx="5940425" cy="1363345"/>
+                    </a:xfrm>
+                    <a:prstGeom prst="rect">
+                      <a:avLst/>
+                    </a:prstGeom>
+                  </pic:spPr>
+                </pic:pic>
+              </a:graphicData>
+            </a:graphic>
+          </wp:inline>
+        </w:drawing>
+      </w:r>
+    </w:p>
+    <w:p>
+      <w:pPr>
+        <w:pStyle w:val="-"/>
+        <w:ind w:firstLine="0"/>
+        <w:rPr>
+          <w:lang w:val="en-US"/>
+        </w:rPr>
+      </w:pPr>
+    </w:p>
+    <w:p>
+      <w:pPr>
+        <w:pStyle w:val="-"/>
+        <w:ind w:firstLine="0"/>
+        <w:rPr>
+          <w:lang w:val="en-US"/>
+        </w:rPr>
+      </w:pPr>
+    </w:p>
+    <w:p>
+      <w:pPr>
+        <w:pStyle w:val="-"/>
+        <w:ind w:firstLine="0"/>
+        <w:rPr>
+          <w:lang w:val="en-US"/>
+        </w:rPr>
+      </w:pPr>
+    </w:p>
+    <w:p>
+      <w:pPr>
+        <w:pStyle w:val="-"/>
+        <w:ind w:firstLine="0"/>
+        <w:rPr>
+          <w:lang w:val="en-US"/>
+        </w:rPr>
+      </w:pPr>
+    </w:p>
+    <w:p>
+      <w:pPr>
+        <w:pStyle w:val="-"/>
+        <w:ind w:firstLine="0"/>
+        <w:rPr>
+          <w:lang w:val="en-US"/>
+        </w:rPr>
+      </w:pPr>
+      <w:r>
+        <w:rPr>
+          <w:lang w:val="en-US"/>
+        </w:rPr>
+        <w:lastRenderedPageBreak/>
+        <w:drawing>
+          <wp:inline distT="0" distB="0" distL="0" distR="0" wp14:anchorId="2DCC1CAA" wp14:editId="47BB4A6C">
+            <wp:extent cx="5940425" cy="4111625"/>
+            <wp:effectExtent l="0" t="0" r="3175" b="3175"/>
+            <wp:docPr id="2090589940" name="Рисунок 1"/>
+            <wp:cNvGraphicFramePr>
+              <a:graphicFrameLocks xmlns:a="http://schemas.openxmlformats.org/drawingml/2006/main" noChangeAspect="1"/>
+            </wp:cNvGraphicFramePr>
+            <a:graphic xmlns:a="http://schemas.openxmlformats.org/drawingml/2006/main">
+              <a:graphicData uri="http://schemas.openxmlformats.org/drawingml/2006/picture">
+                <pic:pic xmlns:pic="http://schemas.openxmlformats.org/drawingml/2006/picture">
+                  <pic:nvPicPr>
+                    <pic:cNvPr id="2090589940" name=""/>
+                    <pic:cNvPicPr/>
+                  </pic:nvPicPr>
+                  <pic:blipFill>
+                    <a:blip r:embed="rId37"/>
+                    <a:stretch>
+                      <a:fillRect/>
+                    </a:stretch>
+                  </pic:blipFill>
+                  <pic:spPr>
+                    <a:xfrm>
+                      <a:off x="0" y="0"/>
+                      <a:ext cx="5940425" cy="4111625"/>
+                    </a:xfrm>
+                    <a:prstGeom prst="rect">
+                      <a:avLst/>
+                    </a:prstGeom>
+                  </pic:spPr>
+                </pic:pic>
+              </a:graphicData>
+            </a:graphic>
+          </wp:inline>
+        </w:drawing>
+      </w:r>
+    </w:p>
+    <w:p>
+      <w:pPr>
+        <w:pStyle w:val="-"/>
+        <w:ind w:firstLine="0"/>
+        <w:rPr>
+          <w:lang w:val="en-US"/>
+        </w:rPr>
+      </w:pPr>
+    </w:p>
+    <w:p>
+      <w:pPr>
+        <w:pStyle w:val="-"/>
+        <w:ind w:firstLine="0"/>
+        <w:rPr>
+          <w:lang w:val="en-US"/>
+        </w:rPr>
+      </w:pPr>
+    </w:p>
+    <w:p>
+      <w:pPr>
+        <w:pStyle w:val="-"/>
+        <w:ind w:firstLine="0"/>
+      </w:pPr>
+      <w:r>
+        <w:t>Настройка общего выходного каталога.</w:t>
+      </w:r>
+    </w:p>
+    <w:p>
+      <w:pPr>
+        <w:pStyle w:val="-"/>
+        <w:ind w:firstLine="0"/>
+      </w:pPr>
+    </w:p>
+    <w:p>
+      <w:pPr>
+        <w:pStyle w:val="-"/>
+        <w:ind w:firstLine="0"/>
+      </w:pPr>
+      <w:r>
+        <w:drawing>
+          <wp:inline distT="0" distB="0" distL="0" distR="0" wp14:anchorId="4E4282F7" wp14:editId="71B111CF">
+            <wp:extent cx="5940425" cy="3481705"/>
+            <wp:effectExtent l="0" t="0" r="3175" b="4445"/>
+            <wp:docPr id="42526585" name="Рисунок 1"/>
+            <wp:cNvGraphicFramePr>
+              <a:graphicFrameLocks xmlns:a="http://schemas.openxmlformats.org/drawingml/2006/main" noChangeAspect="1"/>
+            </wp:cNvGraphicFramePr>
+            <a:graphic xmlns:a="http://schemas.openxmlformats.org/drawingml/2006/main">
+              <a:graphicData uri="http://schemas.openxmlformats.org/drawingml/2006/picture">
+                <pic:pic xmlns:pic="http://schemas.openxmlformats.org/drawingml/2006/picture">
+                  <pic:nvPicPr>
+                    <pic:cNvPr id="42526585" name=""/>
+                    <pic:cNvPicPr/>
+                  </pic:nvPicPr>
+                  <pic:blipFill>
+                    <a:blip r:embed="rId38"/>
+                    <a:stretch>
+                      <a:fillRect/>
+                    </a:stretch>
+                  </pic:blipFill>
+                  <pic:spPr>
+                    <a:xfrm>
+                      <a:off x="0" y="0"/>
+                      <a:ext cx="5940425" cy="3481705"/>
+                    </a:xfrm>
+                    <a:prstGeom prst="rect">
+                      <a:avLst/>
+                    </a:prstGeom>
+                  </pic:spPr>
+                </pic:pic>
+              </a:graphicData>
+            </a:graphic>
+          </wp:inline>
+        </w:drawing>
+      </w:r>
+    </w:p>
+    <w:p>
+      <w:pPr>
+        <w:pStyle w:val="-"/>
+        <w:ind w:firstLine="0"/>
+      </w:pPr>
+    </w:p>
+    <w:p>
+      <w:pPr>
+        <w:pStyle w:val="-"/>
+        <w:ind w:firstLine="0"/>
+      </w:pPr>
+    </w:p>
+    <w:p>
+      <w:pPr>
+        <w:pStyle w:val="-"/>
+        <w:ind w:firstLine="0"/>
+      </w:pPr>
+    </w:p>
+    <w:p>
+      <w:pPr>
+        <w:pStyle w:val="-"/>
+        <w:ind w:firstLine="0"/>
+      </w:pPr>
+    </w:p>
+    <w:p>
+      <w:pPr>
+        <w:pStyle w:val="-"/>
+        <w:ind w:firstLine="0"/>
+      </w:pPr>
+      <w:r>
+        <w:drawing>
+          <wp:inline distT="0" distB="0" distL="0" distR="0" wp14:anchorId="0AFF10B8" wp14:editId="218D444B">
+            <wp:extent cx="5940425" cy="6472555"/>
+            <wp:effectExtent l="0" t="0" r="3175" b="4445"/>
+            <wp:docPr id="190730220" name="Рисунок 1"/>
+            <wp:cNvGraphicFramePr>
+              <a:graphicFrameLocks xmlns:a="http://schemas.openxmlformats.org/drawingml/2006/main" noChangeAspect="1"/>
+            </wp:cNvGraphicFramePr>
+            <a:graphic xmlns:a="http://schemas.openxmlformats.org/drawingml/2006/main">
+              <a:graphicData uri="http://schemas.openxmlformats.org/drawingml/2006/picture">
+                <pic:pic xmlns:pic="http://schemas.openxmlformats.org/drawingml/2006/picture">
+                  <pic:nvPicPr>
+                    <pic:cNvPr id="190730220" name=""/>
+                    <pic:cNvPicPr/>
+                  </pic:nvPicPr>
+                  <pic:blipFill>
+                    <a:blip r:embed="rId39"/>
+                    <a:stretch>
+                      <a:fillRect/>
+                    </a:stretch>
+                  </pic:blipFill>
+                  <pic:spPr>
+                    <a:xfrm>
+                      <a:off x="0" y="0"/>
+                      <a:ext cx="5940425" cy="6472555"/>
+                    </a:xfrm>
+                    <a:prstGeom prst="rect">
+                      <a:avLst/>
+                    </a:prstGeom>
+                  </pic:spPr>
+                </pic:pic>
+              </a:graphicData>
+            </a:graphic>
+          </wp:inline>
+        </w:drawing>
+      </w:r>
+    </w:p>
+    <w:p>
+      <w:pPr>
+        <w:pStyle w:val="-"/>
+        <w:ind w:firstLine="0"/>
+      </w:pPr>
+    </w:p>
+    <w:p>
+      <w:pPr>
+        <w:pStyle w:val="-"/>
+        <w:ind w:firstLine="0"/>
+      </w:pPr>
+    </w:p>
+    <w:p>
+      <w:pPr>
+        <w:pStyle w:val="-"/>
+        <w:ind w:firstLine="0"/>
+        <w:rPr>
+          <w:lang w:val="en-US"/>
+        </w:rPr>
+      </w:pPr>
+    </w:p>
+    <w:p>
+      <w:pPr>
+        <w:pStyle w:val="-"/>
+        <w:ind w:firstLine="0"/>
+        <w:rPr>
+          <w:lang w:val="en-US"/>
+        </w:rPr>
+      </w:pPr>
+    </w:p>
+    <w:p>
+      <w:pPr>
+        <w:pStyle w:val="-"/>
+        <w:ind w:firstLine="0"/>
+        <w:rPr>
+          <w:lang w:val="en-US"/>
+        </w:rPr>
+      </w:pPr>
+    </w:p>
+    <w:p>
+      <w:pPr>
+        <w:pStyle w:val="-"/>
+        <w:ind w:firstLine="0"/>
+        <w:rPr>
+          <w:lang w:val="en-US"/>
+        </w:rPr>
+      </w:pPr>
+    </w:p>
+    <w:p>
+      <w:pPr>
+        <w:pStyle w:val="-"/>
+        <w:ind w:firstLine="0"/>
+        <w:rPr>
+          <w:lang w:val="en-US"/>
+        </w:rPr>
+      </w:pPr>
+      <w:r>
+        <w:rPr>
+          <w:lang w:val="en-US"/>
+        </w:rPr>
+        <w:lastRenderedPageBreak/>
+        <w:drawing>
+          <wp:inline distT="0" distB="0" distL="0" distR="0" wp14:anchorId="363A69E9" wp14:editId="2E808BD7">
+            <wp:extent cx="5940425" cy="6472555"/>
+            <wp:effectExtent l="0" t="0" r="3175" b="4445"/>
+            <wp:docPr id="1564022805" name="Рисунок 1"/>
+            <wp:cNvGraphicFramePr>
+              <a:graphicFrameLocks xmlns:a="http://schemas.openxmlformats.org/drawingml/2006/main" noChangeAspect="1"/>
+            </wp:cNvGraphicFramePr>
+            <a:graphic xmlns:a="http://schemas.openxmlformats.org/drawingml/2006/main">
+              <a:graphicData uri="http://schemas.openxmlformats.org/drawingml/2006/picture">
+                <pic:pic xmlns:pic="http://schemas.openxmlformats.org/drawingml/2006/picture">
+                  <pic:nvPicPr>
+                    <pic:cNvPr id="1564022805" name=""/>
+                    <pic:cNvPicPr/>
+                  </pic:nvPicPr>
+                  <pic:blipFill>
+                    <a:blip r:embed="rId40"/>
+                    <a:stretch>
+                      <a:fillRect/>
+                    </a:stretch>
+                  </pic:blipFill>
+                  <pic:spPr>
+                    <a:xfrm>
+                      <a:off x="0" y="0"/>
+                      <a:ext cx="5940425" cy="6472555"/>
+                    </a:xfrm>
+                    <a:prstGeom prst="rect">
+                      <a:avLst/>
+                    </a:prstGeom>
+                  </pic:spPr>
+                </pic:pic>
+              </a:graphicData>
+            </a:graphic>
+          </wp:inline>
+        </w:drawing>
+      </w:r>
+    </w:p>
+    <w:p>
+      <w:pPr>
+        <w:pStyle w:val="-"/>
+        <w:ind w:firstLine="0"/>
+        <w:rPr>
+          <w:lang w:val="en-US"/>
+        </w:rPr>
+      </w:pPr>
+    </w:p>
+    <w:p>
+      <w:pPr>
+        <w:pStyle w:val="-"/>
+        <w:ind w:firstLine="0"/>
+        <w:rPr>
+          <w:lang w:val="en-US"/>
+        </w:rPr>
+      </w:pPr>
+    </w:p>
+    <w:p>
+      <w:pPr>
+        <w:pStyle w:val="-"/>
+        <w:ind w:firstLine="0"/>
+        <w:rPr>
+          <w:lang w:val="en-US"/>
+        </w:rPr>
+      </w:pPr>
+    </w:p>
+    <w:p>
+      <w:pPr>
+        <w:pStyle w:val="-"/>
+        <w:ind w:firstLine="0"/>
+        <w:rPr>
+          <w:lang w:val="en-US"/>
+        </w:rPr>
+      </w:pPr>
+    </w:p>
+    <w:p>
+      <w:pPr>
+        <w:pStyle w:val="-"/>
+        <w:ind w:firstLine="0"/>
+        <w:rPr>
+          <w:lang w:val="en-US"/>
+        </w:rPr>
+      </w:pPr>
+    </w:p>
+    <w:p>
+      <w:pPr>
+        <w:pStyle w:val="-"/>
+        <w:ind w:firstLine="0"/>
+      </w:pPr>
+    </w:p>
+    <w:p>
+      <w:pPr>
+        <w:pStyle w:val="-"/>
+        <w:ind w:firstLine="0"/>
+      </w:pPr>
+    </w:p>
+    <w:p>
+      <w:pPr>
+        <w:pStyle w:val="-"/>
+        <w:ind w:firstLine="0"/>
+      </w:pPr>
+    </w:p>
+    <w:p>
+      <w:pPr>
+        <w:pStyle w:val="-"/>
+        <w:ind w:firstLine="0"/>
+      </w:pPr>
+    </w:p>
+    <w:p>
+      <w:pPr>
+        <w:pStyle w:val="-"/>
+        <w:ind w:firstLine="0"/>
+      </w:pPr>
+    </w:p>
+    <w:p>
+      <w:pPr>
+        <w:pStyle w:val="-"/>
+        <w:ind w:firstLine="0"/>
+      </w:pPr>
+      <w:r>
+        <w:lastRenderedPageBreak/>
+        <w:drawing>
+          <wp:inline distT="0" distB="0" distL="0" distR="0" wp14:anchorId="745316FB" wp14:editId="32A58C8D">
+            <wp:extent cx="5015865" cy="9251950"/>
+            <wp:effectExtent l="0" t="0" r="0" b="6350"/>
+            <wp:docPr id="1422181617" name="Рисунок 1"/>
+            <wp:cNvGraphicFramePr>
+              <a:graphicFrameLocks xmlns:a="http://schemas.openxmlformats.org/drawingml/2006/main" noChangeAspect="1"/>
+            </wp:cNvGraphicFramePr>
+            <a:graphic xmlns:a="http://schemas.openxmlformats.org/drawingml/2006/main">
+              <a:graphicData uri="http://schemas.openxmlformats.org/drawingml/2006/picture">
+                <pic:pic xmlns:pic="http://schemas.openxmlformats.org/drawingml/2006/picture">
+                  <pic:nvPicPr>
+                    <pic:cNvPr id="1422181617" name=""/>
+                    <pic:cNvPicPr/>
+                  </pic:nvPicPr>
+                  <pic:blipFill>
+                    <a:blip r:embed="rId41"/>
+                    <a:stretch>
+                      <a:fillRect/>
+                    </a:stretch>
+                  </pic:blipFill>
+                  <pic:spPr>
+                    <a:xfrm>
+                      <a:off x="0" y="0"/>
+                      <a:ext cx="5015865" cy="9251950"/>
+                    </a:xfrm>
+                    <a:prstGeom prst="rect">
+                      <a:avLst/>
+                    </a:prstGeom>
+                  </pic:spPr>
+                </pic:pic>
+              </a:graphicData>
+            </a:graphic>
+          </wp:inline>
+        </w:drawing>
+      </w:r>
+    </w:p>
+    <w:p>
+      <w:pPr>
+        <w:pStyle w:val="-"/>
+        <w:ind w:firstLine="0"/>
+      </w:pPr>
+      <w:r>
+        <w:lastRenderedPageBreak/>
+        <w:drawing>
+          <wp:inline distT="0" distB="0" distL="0" distR="0" wp14:anchorId="3DE16D25" wp14:editId="513D54BF">
+            <wp:extent cx="5940425" cy="3481705"/>
+            <wp:effectExtent l="0" t="0" r="3175" b="4445"/>
+            <wp:docPr id="1387063197" name="Рисунок 1"/>
+            <wp:cNvGraphicFramePr>
+              <a:graphicFrameLocks xmlns:a="http://schemas.openxmlformats.org/drawingml/2006/main" noChangeAspect="1"/>
+            </wp:cNvGraphicFramePr>
+            <a:graphic xmlns:a="http://schemas.openxmlformats.org/drawingml/2006/main">
+              <a:graphicData uri="http://schemas.openxmlformats.org/drawingml/2006/picture">
+                <pic:pic xmlns:pic="http://schemas.openxmlformats.org/drawingml/2006/picture">
+                  <pic:nvPicPr>
+                    <pic:cNvPr id="1387063197" name=""/>
+                    <pic:cNvPicPr/>
+                  </pic:nvPicPr>
+                  <pic:blipFill>
+                    <a:blip r:embed="rId42"/>
+                    <a:stretch>
+                      <a:fillRect/>
+                    </a:stretch>
+                  </pic:blipFill>
+                  <pic:spPr>
+                    <a:xfrm>
+                      <a:off x="0" y="0"/>
+                      <a:ext cx="5940425" cy="3481705"/>
+                    </a:xfrm>
+                    <a:prstGeom prst="rect">
+                      <a:avLst/>
+                    </a:prstGeom>
+                  </pic:spPr>
+                </pic:pic>
+              </a:graphicData>
+            </a:graphic>
+          </wp:inline>
+        </w:drawing>
+      </w:r>
+    </w:p>
+    <w:p>
+      <w:pPr>
+        <w:pStyle w:val="-"/>
+        <w:ind w:firstLine="0"/>
+      </w:pPr>
+    </w:p>
+    <w:p>
+      <w:pPr>
+        <w:pStyle w:val="-"/>
+        <w:ind w:firstLine="0"/>
+      </w:pPr>
+      <w:r>
+        <w:drawing>
+          <wp:inline distT="0" distB="0" distL="0" distR="0" wp14:anchorId="716F2D71" wp14:editId="27E9857B">
+            <wp:extent cx="5940425" cy="4044950"/>
+            <wp:effectExtent l="0" t="0" r="3175" b="0"/>
+            <wp:docPr id="407228305" name="Рисунок 1"/>
+            <wp:cNvGraphicFramePr>
+              <a:graphicFrameLocks xmlns:a="http://schemas.openxmlformats.org/drawingml/2006/main" noChangeAspect="1"/>
+            </wp:cNvGraphicFramePr>
+            <a:graphic xmlns:a="http://schemas.openxmlformats.org/drawingml/2006/main">
+              <a:graphicData uri="http://schemas.openxmlformats.org/drawingml/2006/picture">
+                <pic:pic xmlns:pic="http://schemas.openxmlformats.org/drawingml/2006/picture">
+                  <pic:nvPicPr>
+                    <pic:cNvPr id="407228305" name=""/>
+                    <pic:cNvPicPr/>
+                  </pic:nvPicPr>
+                  <pic:blipFill>
+                    <a:blip r:embed="rId43"/>
+                    <a:stretch>
+                      <a:fillRect/>
+                    </a:stretch>
+                  </pic:blipFill>
+                  <pic:spPr>
+                    <a:xfrm>
+                      <a:off x="0" y="0"/>
+                      <a:ext cx="5940425" cy="4044950"/>
+                    </a:xfrm>
+                    <a:prstGeom prst="rect">
+                      <a:avLst/>
+                    </a:prstGeom>
+                  </pic:spPr>
+                </pic:pic>
+              </a:graphicData>
+            </a:graphic>
+          </wp:inline>
+        </w:drawing>
+      </w:r>
+    </w:p>
+    <w:p>
+      <w:pPr>
+        <w:pStyle w:val="-"/>
+        <w:ind w:firstLine="0"/>
+      </w:pPr>
+    </w:p>
+    <w:p>
+      <w:pPr>
+        <w:pStyle w:val="-"/>
+        <w:ind w:firstLine="0"/>
+      </w:pPr>
+    </w:p>
+    <w:p>
+      <w:pPr>
+        <w:pStyle w:val="-"/>
+        <w:ind w:firstLine="0"/>
+      </w:pPr>
+    </w:p>
+    <w:p>
+      <w:pPr>
+        <w:pStyle w:val="-"/>
+        <w:ind w:firstLine="0"/>
+      </w:pPr>
+    </w:p>
+    <w:p>
+      <w:pPr>
+        <w:pStyle w:val="-"/>
+        <w:ind w:firstLine="0"/>
+      </w:pPr>
+      <w:r>
+        <w:lastRenderedPageBreak/>
+        <w:drawing>
+          <wp:inline distT="0" distB="0" distL="0" distR="0" wp14:anchorId="3AB62600" wp14:editId="2E81FAED">
+            <wp:extent cx="5940425" cy="2510155"/>
+            <wp:effectExtent l="0" t="0" r="3175" b="4445"/>
+            <wp:docPr id="209416108" name="Рисунок 1"/>
+            <wp:cNvGraphicFramePr>
+              <a:graphicFrameLocks xmlns:a="http://schemas.openxmlformats.org/drawingml/2006/main" noChangeAspect="1"/>
+            </wp:cNvGraphicFramePr>
+            <a:graphic xmlns:a="http://schemas.openxmlformats.org/drawingml/2006/main">
+              <a:graphicData uri="http://schemas.openxmlformats.org/drawingml/2006/picture">
+                <pic:pic xmlns:pic="http://schemas.openxmlformats.org/drawingml/2006/picture">
+                  <pic:nvPicPr>
+                    <pic:cNvPr id="209416108" name=""/>
+                    <pic:cNvPicPr/>
+                  </pic:nvPicPr>
+                  <pic:blipFill>
+                    <a:blip r:embed="rId44"/>
+                    <a:stretch>
+                      <a:fillRect/>
+                    </a:stretch>
+                  </pic:blipFill>
+                  <pic:spPr>
+                    <a:xfrm>
+                      <a:off x="0" y="0"/>
+                      <a:ext cx="5940425" cy="2510155"/>
+                    </a:xfrm>
+                    <a:prstGeom prst="rect">
+                      <a:avLst/>
+                    </a:prstGeom>
+                  </pic:spPr>
+                </pic:pic>
+              </a:graphicData>
+            </a:graphic>
+          </wp:inline>
+        </w:drawing>
+      </w:r>
+    </w:p>
+    <w:p>
+      <w:pPr>
+        <w:pStyle w:val="-"/>
+        <w:ind w:firstLine="0"/>
+      </w:pPr>
+    </w:p>
+    <w:p>
+      <w:pPr>
+        <w:pStyle w:val="-"/>
+        <w:ind w:firstLine="0"/>
+      </w:pPr>
+    </w:p>
+    <w:p>
+      <w:pPr>
+        <w:pStyle w:val="-"/>
+        <w:ind w:firstLine="0"/>
+      </w:pPr>
+    </w:p>
+    <w:p>
+      <w:pPr>
+        <w:pStyle w:val="-"/>
+        <w:ind w:firstLine="0"/>
+      </w:pPr>
+    </w:p>
+    <w:p>
+      <w:pPr>
+        <w:pStyle w:val="-"/>
+        <w:ind w:firstLine="0"/>
+      </w:pPr>
+    </w:p>
+    <w:p>
+      <w:pPr>
+        <w:pStyle w:val="-"/>
+      </w:pPr>
+    </w:p>
+    <w:p>
+      <w:pPr>
+        <w:pStyle w:val="-"/>
+      </w:pPr>
+    </w:p>
+    <w:p>
+      <w:pPr>
+        <w:pStyle w:val="-"/>
+      </w:pPr>
+      <w:r>
+        <w:drawing>
+          <wp:inline distT="0" distB="0" distL="0" distR="0" wp14:anchorId="747331BA" wp14:editId="62DB5506">
+            <wp:extent cx="5940425" cy="4324350"/>
+            <wp:effectExtent l="0" t="0" r="3175" b="0"/>
+            <wp:docPr id="1923144536" name="Рисунок 1"/>
+            <wp:cNvGraphicFramePr>
+              <a:graphicFrameLocks xmlns:a="http://schemas.openxmlformats.org/drawingml/2006/main" noChangeAspect="1"/>
+            </wp:cNvGraphicFramePr>
+            <a:graphic xmlns:a="http://schemas.openxmlformats.org/drawingml/2006/main">
+              <a:graphicData uri="http://schemas.openxmlformats.org/drawingml/2006/picture">
+                <pic:pic xmlns:pic="http://schemas.openxmlformats.org/drawingml/2006/picture">
+                  <pic:nvPicPr>
+                    <pic:cNvPr id="1923144536" name=""/>
+                    <pic:cNvPicPr/>
+                  </pic:nvPicPr>
+                  <pic:blipFill>
+                    <a:blip r:embed="rId45"/>
+                    <a:stretch>
+                      <a:fillRect/>
+                    </a:stretch>
+                  </pic:blipFill>
+                  <pic:spPr>
+                    <a:xfrm>
+                      <a:off x="0" y="0"/>
+                      <a:ext cx="5940425" cy="4324350"/>
+                    </a:xfrm>
+                    <a:prstGeom prst="rect">
+                      <a:avLst/>
+                    </a:prstGeom>
+                  </pic:spPr>
+                </pic:pic>
+              </a:graphicData>
+            </a:graphic>
+          </wp:inline>
+        </w:drawing>
+      </w:r>
+    </w:p>
+    <w:p>
+      <w:pPr>
+        <w:pStyle w:val="-"/>
+        <w:ind w:firstLine="0"/>
+      </w:pPr>
+      <w:r>
+        <w:lastRenderedPageBreak/>
+        <w:drawing>
+          <wp:inline distT="0" distB="0" distL="0" distR="0" wp14:anchorId="138A5FB7" wp14:editId="37F4C837">
+            <wp:extent cx="5940425" cy="4767580"/>
+            <wp:effectExtent l="0" t="0" r="3175" b="0"/>
+            <wp:docPr id="554115611" name="Рисунок 1"/>
+            <wp:cNvGraphicFramePr>
+              <a:graphicFrameLocks xmlns:a="http://schemas.openxmlformats.org/drawingml/2006/main" noChangeAspect="1"/>
+            </wp:cNvGraphicFramePr>
+            <a:graphic xmlns:a="http://schemas.openxmlformats.org/drawingml/2006/main">
+              <a:graphicData uri="http://schemas.openxmlformats.org/drawingml/2006/picture">
+                <pic:pic xmlns:pic="http://schemas.openxmlformats.org/drawingml/2006/picture">
+                  <pic:nvPicPr>
+                    <pic:cNvPr id="554115611" name=""/>
+                    <pic:cNvPicPr/>
+                  </pic:nvPicPr>
+                  <pic:blipFill>
+                    <a:blip r:embed="rId46"/>
+                    <a:stretch>
+                      <a:fillRect/>
+                    </a:stretch>
+                  </pic:blipFill>
+                  <pic:spPr>
+                    <a:xfrm>
+                      <a:off x="0" y="0"/>
+                      <a:ext cx="5940425" cy="4767580"/>
+                    </a:xfrm>
+                    <a:prstGeom prst="rect">
+                      <a:avLst/>
+                    </a:prstGeom>
+                  </pic:spPr>
+                </pic:pic>
+              </a:graphicData>
+            </a:graphic>
+          </wp:inline>
+        </w:drawing>
+      </w:r>
+    </w:p>
+    <w:p>
+      <w:pPr>
+        <w:pStyle w:val="-"/>
+        <w:ind w:firstLine="0"/>
+      </w:pPr>
+    </w:p>
+    <w:p>
+      <w:pPr>
+        <w:pStyle w:val="-"/>
+        <w:ind w:firstLine="0"/>
+      </w:pPr>
+    </w:p>
+    <w:p>
+      <w:pPr>
+        <w:pStyle w:val="-"/>
+        <w:ind w:firstLine="0"/>
+      </w:pPr>
+    </w:p>
+    <w:p>
+      <w:pPr>
+        <w:pStyle w:val="-"/>
+      </w:pPr>
+    </w:p>
+    <w:p>
+      <w:pPr>
+        <w:pStyle w:val="-"/>
+        <w:ind w:firstLine="0"/>
+      </w:pPr>
+      <w:r>
+        <w:lastRenderedPageBreak/>
+        <w:drawing>
+          <wp:inline distT="0" distB="0" distL="0" distR="0" wp14:anchorId="435A18D8" wp14:editId="3E34B650">
+            <wp:extent cx="5940425" cy="3557905"/>
+            <wp:effectExtent l="0" t="0" r="3175" b="4445"/>
+            <wp:docPr id="1452462988" name="Рисунок 1"/>
+            <wp:cNvGraphicFramePr>
+              <a:graphicFrameLocks xmlns:a="http://schemas.openxmlformats.org/drawingml/2006/main" noChangeAspect="1"/>
+            </wp:cNvGraphicFramePr>
+            <a:graphic xmlns:a="http://schemas.openxmlformats.org/drawingml/2006/main">
+              <a:graphicData uri="http://schemas.openxmlformats.org/drawingml/2006/picture">
+                <pic:pic xmlns:pic="http://schemas.openxmlformats.org/drawingml/2006/picture">
+                  <pic:nvPicPr>
+                    <pic:cNvPr id="1452462988" name=""/>
+                    <pic:cNvPicPr/>
+                  </pic:nvPicPr>
+                  <pic:blipFill>
+                    <a:blip r:embed="rId47"/>
+                    <a:stretch>
+                      <a:fillRect/>
+                    </a:stretch>
+                  </pic:blipFill>
+                  <pic:spPr>
+                    <a:xfrm>
+                      <a:off x="0" y="0"/>
+                      <a:ext cx="5940425" cy="3557905"/>
+                    </a:xfrm>
+                    <a:prstGeom prst="rect">
+                      <a:avLst/>
+                    </a:prstGeom>
+                  </pic:spPr>
+                </pic:pic>
+              </a:graphicData>
+            </a:graphic>
+          </wp:inline>
+        </w:drawing>
+      </w:r>
+    </w:p>
+    <w:p>
+      <w:pPr>
+        <w:pStyle w:val="-"/>
+        <w:ind w:firstLine="0"/>
+      </w:pPr>
+    </w:p>
+    <w:p>
+      <w:pPr>
+        <w:pStyle w:val="-"/>
+        <w:ind w:firstLine="0"/>
+      </w:pPr>
+    </w:p>
+    <w:p>
+      <w:pPr>
+        <w:pStyle w:val="-"/>
+        <w:ind w:firstLine="0"/>
+      </w:pPr>
+      <w:r>
+        <w:drawing>
+          <wp:inline distT="0" distB="0" distL="0" distR="0" wp14:anchorId="0CCC44F2" wp14:editId="16059CF8">
+            <wp:extent cx="5940425" cy="3070225"/>
+            <wp:effectExtent l="0" t="0" r="3175" b="0"/>
+            <wp:docPr id="2010578913" name="Рисунок 1"/>
+            <wp:cNvGraphicFramePr>
+              <a:graphicFrameLocks xmlns:a="http://schemas.openxmlformats.org/drawingml/2006/main" noChangeAspect="1"/>
+            </wp:cNvGraphicFramePr>
+            <a:graphic xmlns:a="http://schemas.openxmlformats.org/drawingml/2006/main">
+              <a:graphicData uri="http://schemas.openxmlformats.org/drawingml/2006/picture">
+                <pic:pic xmlns:pic="http://schemas.openxmlformats.org/drawingml/2006/picture">
+                  <pic:nvPicPr>
+                    <pic:cNvPr id="2010578913" name=""/>
+                    <pic:cNvPicPr/>
+                  </pic:nvPicPr>
+                  <pic:blipFill>
+                    <a:blip r:embed="rId48"/>
+                    <a:stretch>
+                      <a:fillRect/>
+                    </a:stretch>
+                  </pic:blipFill>
+                  <pic:spPr>
+                    <a:xfrm>
+                      <a:off x="0" y="0"/>
+                      <a:ext cx="5940425" cy="3070225"/>
+                    </a:xfrm>
+                    <a:prstGeom prst="rect">
+                      <a:avLst/>
+                    </a:prstGeom>
+                  </pic:spPr>
+                </pic:pic>
+              </a:graphicData>
+            </a:graphic>
+          </wp:inline>
+        </w:drawing>
+      </w:r>
+    </w:p>
+    <w:p>
+      <w:pPr>
+        <w:pStyle w:val="-"/>
+        <w:ind w:firstLine="0"/>
+      </w:pPr>
+    </w:p>
+    <w:p>
+      <w:pPr>
+        <w:pStyle w:val="-"/>
+        <w:ind w:firstLine="0"/>
+      </w:pPr>
+    </w:p>
+    <w:p>
+      <w:pPr>
+        <w:pStyle w:val="-"/>
+        <w:ind w:firstLine="0"/>
+      </w:pPr>
+      <w:r>
+        <w:lastRenderedPageBreak/>
+        <w:drawing>
+          <wp:inline distT="0" distB="0" distL="0" distR="0" wp14:anchorId="4E244B85" wp14:editId="0DFD9D7E">
+            <wp:extent cx="5940425" cy="4481830"/>
+            <wp:effectExtent l="0" t="0" r="3175" b="0"/>
+            <wp:docPr id="1942194254" name="Рисунок 1"/>
+            <wp:cNvGraphicFramePr>
+              <a:graphicFrameLocks xmlns:a="http://schemas.openxmlformats.org/drawingml/2006/main" noChangeAspect="1"/>
+            </wp:cNvGraphicFramePr>
+            <a:graphic xmlns:a="http://schemas.openxmlformats.org/drawingml/2006/main">
+              <a:graphicData uri="http://schemas.openxmlformats.org/drawingml/2006/picture">
+                <pic:pic xmlns:pic="http://schemas.openxmlformats.org/drawingml/2006/picture">
+                  <pic:nvPicPr>
+                    <pic:cNvPr id="1942194254" name=""/>
+                    <pic:cNvPicPr/>
+                  </pic:nvPicPr>
+                  <pic:blipFill>
+                    <a:blip r:embed="rId49"/>
+                    <a:stretch>
+                      <a:fillRect/>
+                    </a:stretch>
+                  </pic:blipFill>
+                  <pic:spPr>
+                    <a:xfrm>
+                      <a:off x="0" y="0"/>
+                      <a:ext cx="5940425" cy="4481830"/>
+                    </a:xfrm>
+                    <a:prstGeom prst="rect">
+                      <a:avLst/>
+                    </a:prstGeom>
+                  </pic:spPr>
+                </pic:pic>
+              </a:graphicData>
+            </a:graphic>
+          </wp:inline>
+        </w:drawing>
+      </w:r>
+    </w:p>
+    <w:p>
+      <w:pPr>
+        <w:pStyle w:val="-"/>
+        <w:ind w:firstLine="0"/>
+      </w:pPr>
+    </w:p>
+    <w:p>
+      <w:pPr>
+        <w:pStyle w:val="-"/>
+        <w:ind w:firstLine="0"/>
+      </w:pPr>
+      <w:r>
+        <w:drawing>
+          <wp:inline distT="0" distB="0" distL="0" distR="0" wp14:anchorId="5CA53199" wp14:editId="1B0A2BF1">
+            <wp:extent cx="5940425" cy="2239010"/>
+            <wp:effectExtent l="0" t="0" r="3175" b="8890"/>
+            <wp:docPr id="147945842" name="Рисунок 1"/>
+            <wp:cNvGraphicFramePr>
+              <a:graphicFrameLocks xmlns:a="http://schemas.openxmlformats.org/drawingml/2006/main" noChangeAspect="1"/>
+            </wp:cNvGraphicFramePr>
+            <a:graphic xmlns:a="http://schemas.openxmlformats.org/drawingml/2006/main">
+              <a:graphicData uri="http://schemas.openxmlformats.org/drawingml/2006/picture">
+                <pic:pic xmlns:pic="http://schemas.openxmlformats.org/drawingml/2006/picture">
+                  <pic:nvPicPr>
+                    <pic:cNvPr id="147945842" name=""/>
+                    <pic:cNvPicPr/>
+                  </pic:nvPicPr>
+                  <pic:blipFill>
+                    <a:blip r:embed="rId50"/>
+                    <a:stretch>
+                      <a:fillRect/>
+                    </a:stretch>
+                  </pic:blipFill>
+                  <pic:spPr>
+                    <a:xfrm>
+                      <a:off x="0" y="0"/>
+                      <a:ext cx="5940425" cy="2239010"/>
+                    </a:xfrm>
+                    <a:prstGeom prst="rect">
+                      <a:avLst/>
+                    </a:prstGeom>
+                  </pic:spPr>
+                </pic:pic>
+              </a:graphicData>
+            </a:graphic>
+          </wp:inline>
+        </w:drawing>
+      </w:r>
+    </w:p>
+    <w:p>
+      <w:pPr>
+        <w:pStyle w:val="-"/>
+        <w:ind w:firstLine="0"/>
+      </w:pPr>
+    </w:p>
+    <w:p>
+      <w:pPr>
+        <w:pStyle w:val="-"/>
+        <w:ind w:firstLine="0"/>
+      </w:pPr>
+    </w:p>
+    <w:p>
+      <w:pPr>
+        <w:pStyle w:val="-"/>
+        <w:ind w:firstLine="0"/>
+      </w:pPr>
+      <w:r>
+        <w:lastRenderedPageBreak/>
+        <w:drawing>
+          <wp:inline distT="0" distB="0" distL="0" distR="0" wp14:anchorId="76EF3783" wp14:editId="106E85A8">
+            <wp:extent cx="5940425" cy="1660525"/>
+            <wp:effectExtent l="0" t="0" r="3175" b="0"/>
+            <wp:docPr id="359317682" name="Рисунок 1"/>
+            <wp:cNvGraphicFramePr>
+              <a:graphicFrameLocks xmlns:a="http://schemas.openxmlformats.org/drawingml/2006/main" noChangeAspect="1"/>
+            </wp:cNvGraphicFramePr>
+            <a:graphic xmlns:a="http://schemas.openxmlformats.org/drawingml/2006/main">
+              <a:graphicData uri="http://schemas.openxmlformats.org/drawingml/2006/picture">
+                <pic:pic xmlns:pic="http://schemas.openxmlformats.org/drawingml/2006/picture">
+                  <pic:nvPicPr>
+                    <pic:cNvPr id="359317682" name=""/>
+                    <pic:cNvPicPr/>
+                  </pic:nvPicPr>
+                  <pic:blipFill>
+                    <a:blip r:embed="rId51"/>
+                    <a:stretch>
+                      <a:fillRect/>
+                    </a:stretch>
+                  </pic:blipFill>
+                  <pic:spPr>
+                    <a:xfrm>
+                      <a:off x="0" y="0"/>
+                      <a:ext cx="5940425" cy="1660525"/>
+                    </a:xfrm>
+                    <a:prstGeom prst="rect">
+                      <a:avLst/>
+                    </a:prstGeom>
+                  </pic:spPr>
+                </pic:pic>
+              </a:graphicData>
+            </a:graphic>
+          </wp:inline>
+        </w:drawing>
+      </w:r>
+    </w:p>
+    <w:p>
+      <w:pPr>
+        <w:pStyle w:val="-"/>
+        <w:ind w:firstLine="0"/>
+      </w:pPr>
+    </w:p>
+    <w:p>
+      <w:pPr>
+        <w:pStyle w:val="-"/>
+        <w:ind w:firstLine="0"/>
+      </w:pPr>
+      <w:r>
+        <w:drawing>
+          <wp:inline distT="0" distB="0" distL="0" distR="0" wp14:anchorId="343D0588" wp14:editId="1153E871">
+            <wp:extent cx="5940425" cy="3404235"/>
+            <wp:effectExtent l="0" t="0" r="3175" b="5715"/>
+            <wp:docPr id="375598311" name="Рисунок 1"/>
+            <wp:cNvGraphicFramePr>
+              <a:graphicFrameLocks xmlns:a="http://schemas.openxmlformats.org/drawingml/2006/main" noChangeAspect="1"/>
+            </wp:cNvGraphicFramePr>
+            <a:graphic xmlns:a="http://schemas.openxmlformats.org/drawingml/2006/main">
+              <a:graphicData uri="http://schemas.openxmlformats.org/drawingml/2006/picture">
+                <pic:pic xmlns:pic="http://schemas.openxmlformats.org/drawingml/2006/picture">
+                  <pic:nvPicPr>
+                    <pic:cNvPr id="375598311" name=""/>
+                    <pic:cNvPicPr/>
+                  </pic:nvPicPr>
+                  <pic:blipFill>
+                    <a:blip r:embed="rId52"/>
+                    <a:stretch>
+                      <a:fillRect/>
+                    </a:stretch>
+                  </pic:blipFill>
+                  <pic:spPr>
+                    <a:xfrm>
+                      <a:off x="0" y="0"/>
+                      <a:ext cx="5940425" cy="3404235"/>
+                    </a:xfrm>
+                    <a:prstGeom prst="rect">
+                      <a:avLst/>
+                    </a:prstGeom>
+                  </pic:spPr>
+                </pic:pic>
+              </a:graphicData>
+            </a:graphic>
+          </wp:inline>
+        </w:drawing>
+      </w:r>
+    </w:p>
+    <w:p>
+      <w:pPr>
+        <w:pStyle w:val="-"/>
+        <w:ind w:firstLine="0"/>
+      </w:pPr>
+    </w:p>
+    <w:p>
+      <w:pPr>
+        <w:pStyle w:val="-"/>
+        <w:ind w:firstLine="0"/>
+      </w:pPr>
+      <w:r>
+        <w:lastRenderedPageBreak/>
+        <w:drawing>
+          <wp:inline distT="0" distB="0" distL="0" distR="0" wp14:anchorId="4A6E0989" wp14:editId="4A41B401">
+            <wp:extent cx="5940425" cy="3557905"/>
+            <wp:effectExtent l="0" t="0" r="3175" b="4445"/>
+            <wp:docPr id="1599959332" name="Рисунок 1"/>
+            <wp:cNvGraphicFramePr>
+              <a:graphicFrameLocks xmlns:a="http://schemas.openxmlformats.org/drawingml/2006/main" noChangeAspect="1"/>
+            </wp:cNvGraphicFramePr>
+            <a:graphic xmlns:a="http://schemas.openxmlformats.org/drawingml/2006/main">
+              <a:graphicData uri="http://schemas.openxmlformats.org/drawingml/2006/picture">
+                <pic:pic xmlns:pic="http://schemas.openxmlformats.org/drawingml/2006/picture">
+                  <pic:nvPicPr>
+                    <pic:cNvPr id="1452462988" name=""/>
+                    <pic:cNvPicPr/>
+                  </pic:nvPicPr>
+                  <pic:blipFill>
+                    <a:blip r:embed="rId47"/>
+                    <a:stretch>
+                      <a:fillRect/>
+                    </a:stretch>
+                  </pic:blipFill>
+                  <pic:spPr>
+                    <a:xfrm>
+                      <a:off x="0" y="0"/>
+                      <a:ext cx="5940425" cy="3557905"/>
+                    </a:xfrm>
+                    <a:prstGeom prst="rect">
+                      <a:avLst/>
+                    </a:prstGeom>
+                  </pic:spPr>
+                </pic:pic>
+              </a:graphicData>
+            </a:graphic>
+          </wp:inline>
+        </w:drawing>
+      </w:r>
+    </w:p>
+    <w:p>
+      <w:pPr>
+        <w:pStyle w:val="-"/>
+        <w:ind w:firstLine="0"/>
+      </w:pPr>
+    </w:p>
+    <w:p>
+      <w:pPr>
+        <w:pStyle w:val="-"/>
+        <w:ind w:firstLine="0"/>
+      </w:pPr>
+    </w:p>
+    <w:p>
+      <w:pPr>
+        <w:pStyle w:val="-"/>
+        <w:ind w:firstLine="0"/>
+      </w:pPr>
+    </w:p>
+    <w:p>
+      <w:pPr>
+        <w:pStyle w:val="-"/>
+        <w:ind w:firstLine="0"/>
+      </w:pPr>
+    </w:p>
+    <w:p>
+      <w:pPr>
+        <w:pStyle w:val="-"/>
+        <w:ind w:firstLine="0"/>
+      </w:pPr>
+    </w:p>
+    <w:p>
+      <w:pPr>
+        <w:pStyle w:val="-"/>
+        <w:ind w:firstLine="0"/>
+      </w:pPr>
+    </w:p>
+    <w:p>
+      <w:pPr>
+        <w:pStyle w:val="-"/>
+        <w:ind w:firstLine="0"/>
+      </w:pPr>
+    </w:p>
+    <w:p>
+      <w:pPr>
+        <w:pStyle w:val="-"/>
+        <w:ind w:firstLine="0"/>
+      </w:pPr>
+    </w:p>
+    <w:p>
+      <w:pPr>
+        <w:pStyle w:val="-"/>
+        <w:ind w:firstLine="0"/>
+      </w:pPr>
+    </w:p>
+    <w:p>
+      <w:pPr>
+        <w:pStyle w:val="-"/>
+        <w:ind w:firstLine="0"/>
+      </w:pPr>
+    </w:p>
+    <w:p>
+      <w:pPr>
+        <w:pStyle w:val="-"/>
+        <w:ind w:firstLine="0"/>
+      </w:pPr>
+    </w:p>
+    <w:p>
+      <w:pPr>
+        <w:pStyle w:val="-"/>
+        <w:ind w:firstLine="0"/>
+      </w:pPr>
+    </w:p>
+    <w:p>
+      <w:pPr>
+        <w:pStyle w:val="-"/>
+        <w:rPr>
+          <w:lang w:val="en-US"/>
+        </w:rPr>
+      </w:pPr>
+    </w:p>
+    <w:p>
+      <w:pPr>
+        <w:pStyle w:val="-"/>
+        <w:rPr>
+          <w:lang w:val="en-US"/>
+        </w:rPr>
+      </w:pPr>
+    </w:p>
+    <w:p>
+      <w:pPr>
+        <w:pStyle w:val="-"/>
+        <w:rPr>
+          <w:lang w:val="en-US"/>
+        </w:rPr>
       </w:pPr>
     </w:p>
     <w:p>
@@ -2408,6 +4741,7 @@
         <w:pStyle w:val="-"/>
       </w:pPr>
       <w:r>
+        <w:lastRenderedPageBreak/>
         <w:t>Изменения в конфигурации сборки проекта</w:t>
       </w:r>
     </w:p>
@@ -2602,6 +4936,7 @@
         <w:pStyle w:val="-"/>
       </w:pPr>
       <w:r>
+        <w:lastRenderedPageBreak/>
         <w:t>* получение режима работы и имени файла.</w:t>
       </w:r>
     </w:p>
@@ -2655,21 +4990,376 @@
         <w:pStyle w:val="-"/>
       </w:pPr>
       <w:r>
+        <w:t>* проверку корректности нумерации списков.</w:t>
+      </w:r>
+    </w:p>
+    <w:p>
+      <w:pPr>
+        <w:pStyle w:val="-"/>
+      </w:pPr>
+    </w:p>
+    <w:p>
+      <w:pPr>
+        <w:pStyle w:val="-"/>
+      </w:pPr>
+      <w:r>
+        <w:t xml:space="preserve">Также в файле находились структура ParseResults для хранения результатов поиска и функция </w:t>
+      </w:r>
+      <w:proofErr w:type="gramStart"/>
+      <w:r>
+        <w:t>main(</w:t>
+      </w:r>
+      <w:proofErr w:type="gramEnd"/>
+      <w:r>
+        <w:t>), которая запускала обработку документа и вывод результатов.</w:t>
+      </w:r>
+    </w:p>
+    <w:p>
+      <w:pPr>
+        <w:pStyle w:val="-"/>
+      </w:pPr>
+    </w:p>
+    <w:p>
+      <w:pPr>
+        <w:pStyle w:val="-"/>
+      </w:pPr>
+      <w:r>
+        <w:t>Обновлённая структура проекта</w:t>
+      </w:r>
+    </w:p>
+    <w:p>
+      <w:pPr>
+        <w:pStyle w:val="-"/>
+      </w:pPr>
+    </w:p>
+    <w:p>
+      <w:pPr>
+        <w:pStyle w:val="-"/>
+      </w:pPr>
+      <w:r>
+        <w:t>После доработки структура проекта стала следующей (см. рисунок 1).</w:t>
+      </w:r>
+    </w:p>
+    <w:p>
+      <w:pPr>
+        <w:pStyle w:val="-"/>
+      </w:pPr>
+    </w:p>
+    <w:p>
+      <w:pPr>
+        <w:pStyle w:val="-"/>
+      </w:pPr>
+      <w:r>
+        <w:t xml:space="preserve">Каталог </w:t>
+      </w:r>
+      <w:proofErr w:type="spellStart"/>
+      <w:r>
+        <w:t>loadtime</w:t>
+      </w:r>
+      <w:proofErr w:type="spellEnd"/>
+      <w:r>
+        <w:t xml:space="preserve"> содержит реализацию библиотеки loadtime.dll, которая подключается к программе неявно (</w:t>
+      </w:r>
+      <w:proofErr w:type="spellStart"/>
+      <w:r>
+        <w:t>load-time</w:t>
+      </w:r>
+      <w:proofErr w:type="spellEnd"/>
+      <w:r>
+        <w:t xml:space="preserve"> </w:t>
+      </w:r>
+      <w:proofErr w:type="spellStart"/>
+      <w:r>
+        <w:t>linking</w:t>
+      </w:r>
+      <w:proofErr w:type="spellEnd"/>
+      <w:r>
+        <w:t>). Это означает, что связь с библиотекой устанавливается ещё на этапе сборки приложения через импортную библиотеку, а сама loadtime.dll автоматически загружается операционной системой при запуске main.exe.</w:t>
+      </w:r>
+    </w:p>
+    <w:p>
+      <w:pPr>
+        <w:pStyle w:val="-"/>
+      </w:pPr>
+    </w:p>
+    <w:p>
+      <w:pPr>
+        <w:pStyle w:val="-"/>
+      </w:pPr>
+      <w:r>
+        <w:t>В файле loadtime.cpp находится реализация экспортируемых функций:</w:t>
+      </w:r>
+    </w:p>
+    <w:p>
+      <w:pPr>
+        <w:pStyle w:val="-"/>
+      </w:pPr>
+    </w:p>
+    <w:p>
+      <w:pPr>
+        <w:pStyle w:val="-"/>
+      </w:pPr>
+      <w:r>
+        <w:t xml:space="preserve">* Функция </w:t>
+      </w:r>
+      <w:proofErr w:type="spellStart"/>
+      <w:r>
+        <w:t>openDocument</w:t>
+      </w:r>
+      <w:proofErr w:type="spellEnd"/>
+      <w:r>
+        <w:t xml:space="preserve"> открывает указанный Markdown-файл, считывает его содержимое и формирует структуру документа для дальнейшей обработки. В данную функцию был перенесён функционал метода </w:t>
+      </w:r>
+      <w:proofErr w:type="gramStart"/>
+      <w:r>
+        <w:t>MarkdownParser::</w:t>
+      </w:r>
+      <w:proofErr w:type="spellStart"/>
+      <w:r>
+        <w:t>readLines</w:t>
+      </w:r>
+      <w:proofErr w:type="spellEnd"/>
+      <w:r>
+        <w:t>(</w:t>
+      </w:r>
+      <w:proofErr w:type="gramEnd"/>
+      <w:r>
+        <w:t xml:space="preserve">) из предыдущей версии проекта. * Функция </w:t>
+      </w:r>
+      <w:proofErr w:type="spellStart"/>
+      <w:r>
         <w:lastRenderedPageBreak/>
-        <w:t>* проверку корректности нумерации списков.</w:t>
-      </w:r>
-    </w:p>
-    <w:p>
-      <w:pPr>
-        <w:pStyle w:val="-"/>
-      </w:pPr>
-    </w:p>
-    <w:p>
-      <w:pPr>
-        <w:pStyle w:val="-"/>
-      </w:pPr>
-      <w:r>
-        <w:t xml:space="preserve">Также в файле находились структура ParseResults для хранения результатов поиска и функция </w:t>
+        <w:t>closeDocument</w:t>
+      </w:r>
+      <w:proofErr w:type="spellEnd"/>
+      <w:r>
+        <w:t xml:space="preserve"> завершает работу с документом и освобождает связанные с ним ресурсы.</w:t>
+      </w:r>
+    </w:p>
+    <w:p>
+      <w:pPr>
+        <w:pStyle w:val="-"/>
+      </w:pPr>
+    </w:p>
+    <w:p>
+      <w:pPr>
+        <w:pStyle w:val="-"/>
+      </w:pPr>
+      <w:r>
+        <w:t xml:space="preserve">В файле </w:t>
+      </w:r>
+      <w:proofErr w:type="spellStart"/>
+      <w:r>
+        <w:t>loadtime.h</w:t>
+      </w:r>
+      <w:proofErr w:type="spellEnd"/>
+      <w:r>
+        <w:t xml:space="preserve"> объявлены экспортируемые функции и структура документа, используемая для передачи данных между библиотеками и основным приложением.</w:t>
+      </w:r>
+    </w:p>
+    <w:p>
+      <w:pPr>
+        <w:pStyle w:val="-"/>
+      </w:pPr>
+    </w:p>
+    <w:p>
+      <w:pPr>
+        <w:pStyle w:val="-"/>
+      </w:pPr>
+      <w:r>
+        <w:t>Эти функции экспортируются из loadtime.dll и вызываются напрямую из main.cpp.</w:t>
+      </w:r>
+    </w:p>
+    <w:p>
+      <w:pPr>
+        <w:pStyle w:val="-"/>
+      </w:pPr>
+    </w:p>
+    <w:p>
+      <w:pPr>
+        <w:pStyle w:val="-"/>
+      </w:pPr>
+      <w:r>
+        <w:t xml:space="preserve">Каталог </w:t>
+      </w:r>
+      <w:proofErr w:type="spellStart"/>
+      <w:r>
+        <w:t>runtime</w:t>
+      </w:r>
+      <w:proofErr w:type="spellEnd"/>
+      <w:r>
+        <w:t xml:space="preserve"> содержит реализацию библиотеки runtime.dll, которая подключается явно во время выполнения программы (</w:t>
+      </w:r>
+      <w:proofErr w:type="spellStart"/>
+      <w:r>
+        <w:t>run-time</w:t>
+      </w:r>
+      <w:proofErr w:type="spellEnd"/>
+      <w:r>
+        <w:t xml:space="preserve"> </w:t>
+      </w:r>
+      <w:proofErr w:type="spellStart"/>
+      <w:r>
+        <w:t>linking</w:t>
+      </w:r>
+      <w:proofErr w:type="spellEnd"/>
+      <w:r>
+        <w:t>). При запуске программы она загружается с помощью функций Windows API (</w:t>
+      </w:r>
+      <w:proofErr w:type="spellStart"/>
+      <w:r>
+        <w:t>LoadLibrary</w:t>
+      </w:r>
+      <w:proofErr w:type="spellEnd"/>
+      <w:r>
+        <w:t xml:space="preserve">), после чего адреса необходимых функций получают через </w:t>
+      </w:r>
+      <w:proofErr w:type="spellStart"/>
+      <w:r>
+        <w:t>GetProcAddress</w:t>
+      </w:r>
+      <w:proofErr w:type="spellEnd"/>
+      <w:r>
+        <w:t>.</w:t>
+      </w:r>
+    </w:p>
+    <w:p>
+      <w:pPr>
+        <w:pStyle w:val="-"/>
+      </w:pPr>
+    </w:p>
+    <w:p>
+      <w:pPr>
+        <w:pStyle w:val="-"/>
+      </w:pPr>
+      <w:r>
+        <w:t>В файле runtime.cpp реализованы экспортируемые функции анализа Markdown-документа:</w:t>
+      </w:r>
+    </w:p>
+    <w:p>
+      <w:pPr>
+        <w:pStyle w:val="-"/>
+      </w:pPr>
+    </w:p>
+    <w:p>
+      <w:pPr>
+        <w:pStyle w:val="-"/>
+      </w:pPr>
+      <w:r>
+        <w:t>* parseHeaders;</w:t>
+      </w:r>
+    </w:p>
+    <w:p>
+      <w:pPr>
+        <w:pStyle w:val="-"/>
+      </w:pPr>
+      <w:r>
+        <w:t>* parseParagraphs;</w:t>
+      </w:r>
+    </w:p>
+    <w:p>
+      <w:pPr>
+        <w:pStyle w:val="-"/>
+      </w:pPr>
+      <w:r>
+        <w:t>* parseOLists.</w:t>
+      </w:r>
+    </w:p>
+    <w:p>
+      <w:pPr>
+        <w:pStyle w:val="-"/>
+      </w:pPr>
+    </w:p>
+    <w:p>
+      <w:pPr>
+        <w:pStyle w:val="-"/>
+      </w:pPr>
+      <w:r>
+        <w:t>В данные функции был перенесён функционал методов класса MarkdownParser из предыдущей версии проекта. Также в runtime.cpp расположена вспомогательная функция isOrderedOneLevelList, выполняющая проверку корректности нумерации элементов списка. Эта функция используется только внутри библиотеки и не экспортируется наружу.</w:t>
+      </w:r>
+    </w:p>
+    <w:p>
+      <w:pPr>
+        <w:pStyle w:val="-"/>
+      </w:pPr>
+    </w:p>
+    <w:p>
+      <w:pPr>
+        <w:pStyle w:val="-"/>
+      </w:pPr>
+      <w:r>
+        <w:t xml:space="preserve">В файле </w:t>
+      </w:r>
+      <w:proofErr w:type="spellStart"/>
+      <w:r>
+        <w:t>runtime.h</w:t>
+      </w:r>
+      <w:proofErr w:type="spellEnd"/>
+      <w:r>
+        <w:t xml:space="preserve"> находятся объявления этих функций.</w:t>
+      </w:r>
+    </w:p>
+    <w:p>
+      <w:pPr>
+        <w:pStyle w:val="-"/>
+      </w:pPr>
+    </w:p>
+    <w:p>
+      <w:pPr>
+        <w:pStyle w:val="-"/>
+      </w:pPr>
+      <w:r>
+        <w:t xml:space="preserve">Файл runtime.def содержит список функций, экспортируемых из библиотеки runtime.dll. Благодаря этому они становятся доступны для получения через </w:t>
+      </w:r>
+      <w:proofErr w:type="spellStart"/>
+      <w:r>
+        <w:t>GetProcAddress</w:t>
+      </w:r>
+      <w:proofErr w:type="spellEnd"/>
+      <w:r>
+        <w:t xml:space="preserve"> после загрузки библиотеки.</w:t>
+      </w:r>
+    </w:p>
+    <w:p>
+      <w:pPr>
+        <w:pStyle w:val="-"/>
+      </w:pPr>
+    </w:p>
+    <w:p>
+      <w:pPr>
+        <w:pStyle w:val="-"/>
+      </w:pPr>
+      <w:r>
+        <w:t>В файле main.cpp остались:</w:t>
+      </w:r>
+    </w:p>
+    <w:p>
+      <w:pPr>
+        <w:pStyle w:val="-"/>
+      </w:pPr>
+    </w:p>
+    <w:p>
+      <w:pPr>
+        <w:pStyle w:val="-"/>
+      </w:pPr>
+      <w:r>
+        <w:t>* класс CmdArgsParser;</w:t>
+      </w:r>
+    </w:p>
+    <w:p>
+      <w:pPr>
+        <w:pStyle w:val="-"/>
+      </w:pPr>
+      <w:r>
+        <w:t>* структура ParseResults;</w:t>
+      </w:r>
+    </w:p>
+    <w:p>
+      <w:pPr>
+        <w:pStyle w:val="-"/>
+      </w:pPr>
+      <w:r>
+        <w:t xml:space="preserve">* функция </w:t>
       </w:r>
       <w:proofErr w:type="gramStart"/>
       <w:r>
@@ -2677,155 +5367,108 @@
       </w:r>
       <w:proofErr w:type="gramEnd"/>
       <w:r>
-        <w:t>), которая запускала обработку документа и вывод результатов.</w:t>
-      </w:r>
-    </w:p>
-    <w:p>
-      <w:pPr>
-        <w:pStyle w:val="-"/>
-      </w:pPr>
-    </w:p>
-    <w:p>
-      <w:pPr>
-        <w:pStyle w:val="-"/>
-      </w:pPr>
-      <w:r>
-        <w:t>Обновлённая структура проекта</w:t>
-      </w:r>
-    </w:p>
-    <w:p>
-      <w:pPr>
-        <w:pStyle w:val="-"/>
-      </w:pPr>
-    </w:p>
-    <w:p>
-      <w:pPr>
-        <w:pStyle w:val="-"/>
-      </w:pPr>
-      <w:r>
-        <w:t>После доработки структура проекта стала следующей (см. рисунок 1).</w:t>
-      </w:r>
-    </w:p>
-    <w:p>
-      <w:pPr>
-        <w:pStyle w:val="-"/>
-      </w:pPr>
-    </w:p>
-    <w:p>
-      <w:pPr>
-        <w:pStyle w:val="-"/>
-      </w:pPr>
-      <w:r>
-        <w:t xml:space="preserve">Каталог </w:t>
-      </w:r>
-      <w:proofErr w:type="spellStart"/>
-      <w:r>
-        <w:t>loadtime</w:t>
-      </w:r>
-      <w:proofErr w:type="spellEnd"/>
-      <w:r>
-        <w:t xml:space="preserve"> содержит реализацию библиотеки loadtime.dll, которая подключается к программе неявно (</w:t>
-      </w:r>
-      <w:proofErr w:type="spellStart"/>
-      <w:r>
-        <w:t>load-time</w:t>
-      </w:r>
-      <w:proofErr w:type="spellEnd"/>
-      <w:r>
-        <w:t xml:space="preserve"> </w:t>
-      </w:r>
-      <w:proofErr w:type="spellStart"/>
-      <w:r>
-        <w:t>linking</w:t>
-      </w:r>
-      <w:proofErr w:type="spellEnd"/>
-      <w:r>
-        <w:t>). Это означает, что связь с библиотекой устанавливается ещё на этапе сборки приложения через импортную библиотеку, а сама loadtime.dll автоматически загружается операционной системой при запуске main.exe.</w:t>
-      </w:r>
-    </w:p>
-    <w:p>
-      <w:pPr>
-        <w:pStyle w:val="-"/>
-      </w:pPr>
-    </w:p>
-    <w:p>
-      <w:pPr>
-        <w:pStyle w:val="-"/>
-      </w:pPr>
-      <w:r>
-        <w:t>В файле loadtime.cpp находится реализация экспортируемых функций:</w:t>
-      </w:r>
-    </w:p>
-    <w:p>
-      <w:pPr>
-        <w:pStyle w:val="-"/>
-      </w:pPr>
-    </w:p>
-    <w:p>
-      <w:pPr>
-        <w:pStyle w:val="-"/>
-      </w:pPr>
-      <w:r>
-        <w:t xml:space="preserve">* Функция </w:t>
-      </w:r>
-      <w:proofErr w:type="spellStart"/>
-      <w:r>
-        <w:t>openDocument</w:t>
-      </w:r>
-      <w:proofErr w:type="spellEnd"/>
-      <w:r>
-        <w:t xml:space="preserve"> открывает указанный Markdown-файл, считывает его содержимое и формирует структуру документа для дальнейшей обработки. В данную функцию был перенесён функционал метода </w:t>
-      </w:r>
-      <w:proofErr w:type="gramStart"/>
-      <w:r>
-        <w:t>MarkdownParser::</w:t>
-      </w:r>
-      <w:proofErr w:type="spellStart"/>
-      <w:r>
-        <w:t>readLines</w:t>
-      </w:r>
-      <w:proofErr w:type="spellEnd"/>
-      <w:r>
-        <w:t>(</w:t>
-      </w:r>
-      <w:proofErr w:type="gramEnd"/>
-      <w:r>
-        <w:t xml:space="preserve">) из предыдущей версии проекта. * Функция </w:t>
-      </w:r>
-      <w:proofErr w:type="spellStart"/>
-      <w:r>
-        <w:t>closeDocument</w:t>
-      </w:r>
-      <w:proofErr w:type="spellEnd"/>
-      <w:r>
-        <w:t xml:space="preserve"> завершает работу с документом и освобождает связанные с ним ресурсы.</w:t>
-      </w:r>
-    </w:p>
-    <w:p>
-      <w:pPr>
-        <w:pStyle w:val="-"/>
-      </w:pPr>
-    </w:p>
-    <w:p>
-      <w:pPr>
-        <w:pStyle w:val="-"/>
-      </w:pPr>
-      <w:r>
-        <w:t xml:space="preserve">В файле </w:t>
-      </w:r>
-      <w:proofErr w:type="spellStart"/>
-      <w:r>
-        <w:t>loadtime.h</w:t>
-      </w:r>
-      <w:proofErr w:type="spellEnd"/>
-      <w:r>
-        <w:t xml:space="preserve"> объявлены экспортируемые функции и структура документа, используемая для передачи данных между библиотеками и основным приложением.</w:t>
-      </w:r>
-    </w:p>
-    <w:p>
-      <w:pPr>
-        <w:pStyle w:val="-"/>
-      </w:pPr>
+        <w:t>).</w:t>
+      </w:r>
+    </w:p>
+    <w:p>
+      <w:pPr>
+        <w:pStyle w:val="-"/>
+      </w:pPr>
+    </w:p>
+    <w:p>
+      <w:pPr>
+        <w:pStyle w:val="-"/>
+      </w:pPr>
+      <w:r>
+        <w:t>Файл отвечает за обработку аргументов командной строки, открытие документа через функции из loadtime.dll, динамическую загрузку runtime.dll, получение адресов экспортируемых функций, вызов функций анализа и вывод результатов обработки Markdown-документа.</w:t>
+      </w:r>
+    </w:p>
+    <w:p>
+      <w:pPr>
+        <w:pStyle w:val="-"/>
+      </w:pPr>
+    </w:p>
+    <w:p>
+      <w:pPr>
+        <w:pStyle w:val="-"/>
+      </w:pPr>
+      <w:r>
+        <w:t>Работа новой структуры</w:t>
+      </w:r>
+    </w:p>
+    <w:p>
+      <w:pPr>
+        <w:pStyle w:val="-"/>
+      </w:pPr>
+    </w:p>
+    <w:p>
+      <w:pPr>
+        <w:pStyle w:val="-"/>
+      </w:pPr>
+      <w:r>
+        <w:t>После запуска программы выполняется следующая последовательность действий:</w:t>
+      </w:r>
+    </w:p>
+    <w:p>
+      <w:pPr>
+        <w:pStyle w:val="-"/>
+      </w:pPr>
+    </w:p>
+    <w:p>
+      <w:pPr>
+        <w:pStyle w:val="-"/>
+      </w:pPr>
+      <w:r>
+        <w:t>1. Обрабатываются аргументы командной строки.</w:t>
+      </w:r>
+    </w:p>
+    <w:p>
+      <w:pPr>
+        <w:pStyle w:val="-"/>
+      </w:pPr>
+      <w:r>
+        <w:t>2. Через loadtime.dll открывается Markdown-файл.</w:t>
+      </w:r>
+    </w:p>
+    <w:p>
+      <w:pPr>
+        <w:pStyle w:val="-"/>
+      </w:pPr>
+      <w:r>
+        <w:t>3. Загружается библиотека runtime.dll.</w:t>
+      </w:r>
+    </w:p>
+    <w:p>
+      <w:pPr>
+        <w:pStyle w:val="-"/>
+      </w:pPr>
+      <w:r>
+        <w:t>4. Получаются адреса функций parseHeaders, parseParagraphs и parseOLists.</w:t>
+      </w:r>
+    </w:p>
+    <w:p>
+      <w:pPr>
+        <w:pStyle w:val="-"/>
+      </w:pPr>
+      <w:r>
+        <w:t>5. В зависимости от режима работы вызывается нужная функция анализа.</w:t>
+      </w:r>
+    </w:p>
+    <w:p>
+      <w:pPr>
+        <w:pStyle w:val="-"/>
+      </w:pPr>
+      <w:r>
+        <w:t>6. Результаты выводятся в консоль.</w:t>
+      </w:r>
+    </w:p>
+    <w:p>
+      <w:pPr>
+        <w:pStyle w:val="-"/>
+      </w:pPr>
+      <w:r>
+        <w:t>7. Библиотека runtime.dll выгружается.</w:t>
+      </w:r>
     </w:p>
     <w:p>
       <w:pPr>
@@ -2833,315 +5476,6 @@
       </w:pPr>
       <w:r>
         <w:lastRenderedPageBreak/>
-        <w:t>Эти функции экспортируются из loadtime.dll и вызываются напрямую из main.cpp.</w:t>
-      </w:r>
-    </w:p>
-    <w:p>
-      <w:pPr>
-        <w:pStyle w:val="-"/>
-      </w:pPr>
-    </w:p>
-    <w:p>
-      <w:pPr>
-        <w:pStyle w:val="-"/>
-      </w:pPr>
-      <w:r>
-        <w:t xml:space="preserve">Каталог </w:t>
-      </w:r>
-      <w:proofErr w:type="spellStart"/>
-      <w:r>
-        <w:t>runtime</w:t>
-      </w:r>
-      <w:proofErr w:type="spellEnd"/>
-      <w:r>
-        <w:t xml:space="preserve"> содержит реализацию библиотеки runtime.dll, которая подключается явно во время выполнения программы (</w:t>
-      </w:r>
-      <w:proofErr w:type="spellStart"/>
-      <w:r>
-        <w:t>run-time</w:t>
-      </w:r>
-      <w:proofErr w:type="spellEnd"/>
-      <w:r>
-        <w:t xml:space="preserve"> </w:t>
-      </w:r>
-      <w:proofErr w:type="spellStart"/>
-      <w:r>
-        <w:t>linking</w:t>
-      </w:r>
-      <w:proofErr w:type="spellEnd"/>
-      <w:r>
-        <w:t>). При запуске программы она загружается с помощью функций Windows API (</w:t>
-      </w:r>
-      <w:proofErr w:type="spellStart"/>
-      <w:r>
-        <w:t>LoadLibrary</w:t>
-      </w:r>
-      <w:proofErr w:type="spellEnd"/>
-      <w:r>
-        <w:t xml:space="preserve">), после чего адреса необходимых функций получают через </w:t>
-      </w:r>
-      <w:proofErr w:type="spellStart"/>
-      <w:r>
-        <w:t>GetProcAddress</w:t>
-      </w:r>
-      <w:proofErr w:type="spellEnd"/>
-      <w:r>
-        <w:t>.</w:t>
-      </w:r>
-    </w:p>
-    <w:p>
-      <w:pPr>
-        <w:pStyle w:val="-"/>
-      </w:pPr>
-    </w:p>
-    <w:p>
-      <w:pPr>
-        <w:pStyle w:val="-"/>
-      </w:pPr>
-      <w:r>
-        <w:t>В файле runtime.cpp реализованы экспортируемые функции анализа Markdown-документа:</w:t>
-      </w:r>
-    </w:p>
-    <w:p>
-      <w:pPr>
-        <w:pStyle w:val="-"/>
-      </w:pPr>
-    </w:p>
-    <w:p>
-      <w:pPr>
-        <w:pStyle w:val="-"/>
-      </w:pPr>
-      <w:r>
-        <w:t>* parseHeaders;</w:t>
-      </w:r>
-    </w:p>
-    <w:p>
-      <w:pPr>
-        <w:pStyle w:val="-"/>
-      </w:pPr>
-      <w:r>
-        <w:t>* parseParagraphs;</w:t>
-      </w:r>
-    </w:p>
-    <w:p>
-      <w:pPr>
-        <w:pStyle w:val="-"/>
-      </w:pPr>
-      <w:r>
-        <w:t>* parseOLists.</w:t>
-      </w:r>
-    </w:p>
-    <w:p>
-      <w:pPr>
-        <w:pStyle w:val="-"/>
-      </w:pPr>
-    </w:p>
-    <w:p>
-      <w:pPr>
-        <w:pStyle w:val="-"/>
-      </w:pPr>
-      <w:r>
-        <w:t>В данные функции был перенесён функционал методов класса MarkdownParser из предыдущей версии проекта. Также в runtime.cpp расположена вспомогательная функция isOrderedOneLevelList, выполняющая проверку корректности нумерации элементов списка. Эта функция используется только внутри библиотеки и не экспортируется наружу.</w:t>
-      </w:r>
-    </w:p>
-    <w:p>
-      <w:pPr>
-        <w:pStyle w:val="-"/>
-      </w:pPr>
-    </w:p>
-    <w:p>
-      <w:pPr>
-        <w:pStyle w:val="-"/>
-      </w:pPr>
-      <w:r>
-        <w:t xml:space="preserve">В файле </w:t>
-      </w:r>
-      <w:proofErr w:type="spellStart"/>
-      <w:r>
-        <w:t>runtime.h</w:t>
-      </w:r>
-      <w:proofErr w:type="spellEnd"/>
-      <w:r>
-        <w:t xml:space="preserve"> находятся объявления этих функций.</w:t>
-      </w:r>
-    </w:p>
-    <w:p>
-      <w:pPr>
-        <w:pStyle w:val="-"/>
-      </w:pPr>
-    </w:p>
-    <w:p>
-      <w:pPr>
-        <w:pStyle w:val="-"/>
-      </w:pPr>
-      <w:r>
-        <w:t xml:space="preserve">Файл runtime.def содержит список функций, экспортируемых из библиотеки runtime.dll. Благодаря этому они становятся доступны для получения через </w:t>
-      </w:r>
-      <w:proofErr w:type="spellStart"/>
-      <w:r>
-        <w:t>GetProcAddress</w:t>
-      </w:r>
-      <w:proofErr w:type="spellEnd"/>
-      <w:r>
-        <w:t xml:space="preserve"> после загрузки библиотеки.</w:t>
-      </w:r>
-    </w:p>
-    <w:p>
-      <w:pPr>
-        <w:pStyle w:val="-"/>
-      </w:pPr>
-    </w:p>
-    <w:p>
-      <w:pPr>
-        <w:pStyle w:val="-"/>
-      </w:pPr>
-      <w:r>
-        <w:t>В файле main.cpp остались:</w:t>
-      </w:r>
-    </w:p>
-    <w:p>
-      <w:pPr>
-        <w:pStyle w:val="-"/>
-      </w:pPr>
-    </w:p>
-    <w:p>
-      <w:pPr>
-        <w:pStyle w:val="-"/>
-      </w:pPr>
-      <w:r>
-        <w:lastRenderedPageBreak/>
-        <w:t>* класс CmdArgsParser;</w:t>
-      </w:r>
-    </w:p>
-    <w:p>
-      <w:pPr>
-        <w:pStyle w:val="-"/>
-      </w:pPr>
-      <w:r>
-        <w:t>* структура ParseResults;</w:t>
-      </w:r>
-    </w:p>
-    <w:p>
-      <w:pPr>
-        <w:pStyle w:val="-"/>
-      </w:pPr>
-      <w:r>
-        <w:t xml:space="preserve">* функция </w:t>
-      </w:r>
-      <w:proofErr w:type="gramStart"/>
-      <w:r>
-        <w:t>main(</w:t>
-      </w:r>
-      <w:proofErr w:type="gramEnd"/>
-      <w:r>
-        <w:t>).</w:t>
-      </w:r>
-    </w:p>
-    <w:p>
-      <w:pPr>
-        <w:pStyle w:val="-"/>
-      </w:pPr>
-    </w:p>
-    <w:p>
-      <w:pPr>
-        <w:pStyle w:val="-"/>
-      </w:pPr>
-      <w:r>
-        <w:t>Файл отвечает за обработку аргументов командной строки, открытие документа через функции из loadtime.dll, динамическую загрузку runtime.dll, получение адресов экспортируемых функций, вызов функций анализа и вывод результатов обработки Markdown-документа.</w:t>
-      </w:r>
-    </w:p>
-    <w:p>
-      <w:pPr>
-        <w:pStyle w:val="-"/>
-      </w:pPr>
-    </w:p>
-    <w:p>
-      <w:pPr>
-        <w:pStyle w:val="-"/>
-      </w:pPr>
-      <w:r>
-        <w:t>Работа новой структуры</w:t>
-      </w:r>
-    </w:p>
-    <w:p>
-      <w:pPr>
-        <w:pStyle w:val="-"/>
-      </w:pPr>
-    </w:p>
-    <w:p>
-      <w:pPr>
-        <w:pStyle w:val="-"/>
-      </w:pPr>
-      <w:r>
-        <w:t>После запуска программы выполняется следующая последовательность действий:</w:t>
-      </w:r>
-    </w:p>
-    <w:p>
-      <w:pPr>
-        <w:pStyle w:val="-"/>
-      </w:pPr>
-    </w:p>
-    <w:p>
-      <w:pPr>
-        <w:pStyle w:val="-"/>
-      </w:pPr>
-      <w:r>
-        <w:t>1. Обрабатываются аргументы командной строки.</w:t>
-      </w:r>
-    </w:p>
-    <w:p>
-      <w:pPr>
-        <w:pStyle w:val="-"/>
-      </w:pPr>
-      <w:r>
-        <w:t>2. Через loadtime.dll открывается Markdown-файл.</w:t>
-      </w:r>
-    </w:p>
-    <w:p>
-      <w:pPr>
-        <w:pStyle w:val="-"/>
-      </w:pPr>
-      <w:r>
-        <w:t>3. Загружается библиотека runtime.dll.</w:t>
-      </w:r>
-    </w:p>
-    <w:p>
-      <w:pPr>
-        <w:pStyle w:val="-"/>
-      </w:pPr>
-      <w:r>
-        <w:t>4. Получаются адреса функций parseHeaders, parseParagraphs и parseOLists.</w:t>
-      </w:r>
-    </w:p>
-    <w:p>
-      <w:pPr>
-        <w:pStyle w:val="-"/>
-      </w:pPr>
-      <w:r>
-        <w:t>5. В зависимости от режима работы вызывается нужная функция анализа.</w:t>
-      </w:r>
-    </w:p>
-    <w:p>
-      <w:pPr>
-        <w:pStyle w:val="-"/>
-      </w:pPr>
-      <w:r>
-        <w:t>6. Результаты выводятся в консоль.</w:t>
-      </w:r>
-    </w:p>
-    <w:p>
-      <w:pPr>
-        <w:pStyle w:val="-"/>
-      </w:pPr>
-      <w:r>
-        <w:t>7. Библиотека runtime.dll выгружается.</w:t>
-      </w:r>
-    </w:p>
-    <w:p>
-      <w:pPr>
-        <w:pStyle w:val="-"/>
-      </w:pPr>
-      <w:r>
         <w:t>8. Выполняется закрытие документа через loadtime.dll.</w:t>
       </w:r>
     </w:p>
@@ -3294,6 +5628,10 @@
         <w:ind w:firstLine="0"/>
       </w:pPr>
       <w:r>
+        <w:rPr>
+          <w:noProof/>
+        </w:rPr>
+        <w:lastRenderedPageBreak/>
         <w:drawing>
           <wp:inline distT="0" distB="0" distL="0" distR="0" wp14:anchorId="396AA35E" wp14:editId="4B0A118F">
             <wp:extent cx="5940425" cy="4144010"/>
@@ -3310,7 +5648,7 @@
                     <pic:cNvPicPr/>
                   </pic:nvPicPr>
                   <pic:blipFill>
-                    <a:blip r:embed="rId24"/>
+                    <a:blip r:embed="rId53"/>
                     <a:stretch>
                       <a:fillRect/>
                     </a:stretch>
@@ -3353,6 +5691,7 @@
       </w:pPr>
       <w:r>
         <w:rPr>
+          <w:noProof/>
           <w:lang w:val="en-US"/>
         </w:rPr>
         <w:lastRenderedPageBreak/>
@@ -3372,7 +5711,7 @@
                     <pic:cNvPicPr/>
                   </pic:nvPicPr>
                   <pic:blipFill>
-                    <a:blip r:embed="rId25"/>
+                    <a:blip r:embed="rId54"/>
                     <a:stretch>
                       <a:fillRect/>
                     </a:stretch>
@@ -3461,6 +5800,9 @@
         </w:rPr>
       </w:pPr>
       <w:r>
+        <w:rPr>
+          <w:noProof/>
+        </w:rPr>
         <w:drawing>
           <wp:inline distT="0" distB="0" distL="0" distR="0" wp14:anchorId="0B1B0C8E" wp14:editId="27BD52B8">
             <wp:extent cx="3724795" cy="1381318"/>
@@ -3477,7 +5819,7 @@
                     <pic:cNvPicPr/>
                   </pic:nvPicPr>
                   <pic:blipFill>
-                    <a:blip r:embed="rId26"/>
+                    <a:blip r:embed="rId55"/>
                     <a:stretch>
                       <a:fillRect/>
                     </a:stretch>
@@ -3516,6 +5858,9 @@
         </w:rPr>
       </w:pPr>
       <w:r>
+        <w:rPr>
+          <w:noProof/>
+        </w:rPr>
         <w:drawing>
           <wp:inline distT="0" distB="0" distL="0" distR="0" wp14:anchorId="251B19FD" wp14:editId="1BC0BAC8">
             <wp:extent cx="5940425" cy="445770"/>
@@ -3532,7 +5877,7 @@
                     <pic:cNvPicPr/>
                   </pic:nvPicPr>
                   <pic:blipFill>
-                    <a:blip r:embed="rId27"/>
+                    <a:blip r:embed="rId56"/>
                     <a:stretch>
                       <a:fillRect/>
                     </a:stretch>
@@ -3577,6 +5922,9 @@
         <w:ind w:firstLine="0"/>
       </w:pPr>
       <w:r>
+        <w:rPr>
+          <w:noProof/>
+        </w:rPr>
         <w:lastRenderedPageBreak/>
         <w:drawing>
           <wp:inline distT="0" distB="0" distL="0" distR="0" wp14:anchorId="4BCA4327" wp14:editId="297F075C">
@@ -3594,7 +5942,7 @@
                     <pic:cNvPicPr/>
                   </pic:nvPicPr>
                   <pic:blipFill>
-                    <a:blip r:embed="rId28"/>
+                    <a:blip r:embed="rId57"/>
                     <a:stretch>
                       <a:fillRect/>
                     </a:stretch>
@@ -3658,6 +6006,7 @@
       </w:pPr>
       <w:r>
         <w:rPr>
+          <w:noProof/>
           <w:lang w:val="en-US"/>
         </w:rPr>
         <w:drawing>
@@ -3676,7 +6025,7 @@
                     <pic:cNvPicPr/>
                   </pic:nvPicPr>
                   <pic:blipFill>
-                    <a:blip r:embed="rId29"/>
+                    <a:blip r:embed="rId58"/>
                     <a:stretch>
                       <a:fillRect/>
                     </a:stretch>
@@ -3843,17 +6192,11 @@
         <w:pStyle w:val="-"/>
         <w:ind w:firstLine="0"/>
         <w:jc w:val="center"/>
-        <w:rPr>
-          <w:lang w:val="en-US"/>
-        </w:rPr>
-      </w:pPr>
-    </w:p>
-    <w:p>
-      <w:pPr>
-        <w:pStyle w:val="-"/>
-        <w:rPr>
-          <w:lang w:val="en-US"/>
-        </w:rPr>
+      </w:pPr>
+    </w:p>
+    <w:p>
+      <w:pPr>
+        <w:pStyle w:val="-"/>
       </w:pPr>
     </w:p>
     <w:p>
@@ -4000,41 +6343,26 @@
     <w:p>
       <w:pPr>
         <w:pStyle w:val="-"/>
-        <w:rPr>
-          <w:lang w:val="en-US"/>
-        </w:rPr>
-      </w:pPr>
-    </w:p>
-    <w:p>
-      <w:pPr>
-        <w:pStyle w:val="-"/>
-        <w:rPr>
-          <w:lang w:val="en-US"/>
-        </w:rPr>
-      </w:pPr>
-    </w:p>
-    <w:p>
-      <w:pPr>
-        <w:pStyle w:val="-"/>
-        <w:rPr>
-          <w:lang w:val="en-US"/>
-        </w:rPr>
-      </w:pPr>
-    </w:p>
-    <w:p>
-      <w:pPr>
-        <w:pStyle w:val="-"/>
-        <w:rPr>
-          <w:lang w:val="en-US"/>
-        </w:rPr>
-      </w:pPr>
-    </w:p>
-    <w:p>
-      <w:pPr>
-        <w:pStyle w:val="-"/>
-        <w:rPr>
-          <w:lang w:val="en-US"/>
-        </w:rPr>
+      </w:pPr>
+    </w:p>
+    <w:p>
+      <w:pPr>
+        <w:pStyle w:val="-"/>
+      </w:pPr>
+    </w:p>
+    <w:p>
+      <w:pPr>
+        <w:pStyle w:val="-"/>
+      </w:pPr>
+    </w:p>
+    <w:p>
+      <w:pPr>
+        <w:pStyle w:val="-"/>
+      </w:pPr>
+    </w:p>
+    <w:p>
+      <w:pPr>
+        <w:pStyle w:val="-"/>
       </w:pPr>
     </w:p>
     <w:p>
@@ -4042,49 +6370,33 @@
         <w:pStyle w:val="-"/>
         <w:ind w:firstLine="0"/>
         <w:jc w:val="center"/>
-        <w:rPr>
-          <w:lang w:val="en-US"/>
-        </w:rPr>
       </w:pPr>
       <w:r>
         <w:t>Приложение</w:t>
       </w:r>
       <w:r>
-        <w:rPr>
-          <w:lang w:val="en-US"/>
-        </w:rPr>
         <w:t xml:space="preserve"> 4 – </w:t>
       </w:r>
       <w:r>
         <w:t>содержимое</w:t>
       </w:r>
       <w:r>
-        <w:rPr>
-          <w:lang w:val="en-US"/>
-        </w:rPr>
         <w:t xml:space="preserve"> </w:t>
       </w:r>
       <w:r>
         <w:t>файла</w:t>
       </w:r>
       <w:r>
-        <w:rPr>
-          <w:lang w:val="en-US"/>
-        </w:rPr>
         <w:t xml:space="preserve"> </w:t>
       </w:r>
       <w:proofErr w:type="gramStart"/>
       <w:r>
-        <w:rPr>
-          <w:lang w:val="en-US"/>
-        </w:rPr>
         <w:t>“</w:t>
       </w:r>
       <w:r>
         <w:rPr>
           <w:i/>
           <w:iCs/>
-          <w:lang w:val="en-US"/>
         </w:rPr>
         <w:t>.</w:t>
       </w:r>
@@ -4098,9 +6410,6 @@
       </w:r>
       <w:proofErr w:type="gramEnd"/>
       <w:r>
-        <w:rPr>
-          <w:lang w:val="en-US"/>
-        </w:rPr>
         <w:t>”</w:t>
       </w:r>
     </w:p>
@@ -4108,36 +6417,24 @@
       <w:pPr>
         <w:pStyle w:val="-"/>
         <w:ind w:firstLine="0"/>
-        <w:rPr>
-          <w:lang w:val="en-US"/>
-        </w:rPr>
-      </w:pPr>
-    </w:p>
-    <w:p>
-      <w:pPr>
-        <w:pStyle w:val="-"/>
-        <w:ind w:firstLine="0"/>
-        <w:rPr>
-          <w:lang w:val="en-US"/>
-        </w:rPr>
-      </w:pPr>
-    </w:p>
-    <w:p>
-      <w:pPr>
-        <w:pStyle w:val="-"/>
-        <w:ind w:firstLine="0"/>
-        <w:rPr>
-          <w:lang w:val="en-US"/>
-        </w:rPr>
-      </w:pPr>
-    </w:p>
-    <w:p>
-      <w:pPr>
-        <w:pStyle w:val="-"/>
-        <w:ind w:firstLine="0"/>
-        <w:rPr>
-          <w:lang w:val="en-US"/>
-        </w:rPr>
+      </w:pPr>
+    </w:p>
+    <w:p>
+      <w:pPr>
+        <w:pStyle w:val="-"/>
+        <w:ind w:firstLine="0"/>
+      </w:pPr>
+    </w:p>
+    <w:p>
+      <w:pPr>
+        <w:pStyle w:val="-"/>
+        <w:ind w:firstLine="0"/>
+      </w:pPr>
+    </w:p>
+    <w:p>
+      <w:pPr>
+        <w:pStyle w:val="-"/>
+        <w:ind w:firstLine="0"/>
       </w:pPr>
     </w:p>
     <w:p>
@@ -4204,18 +6501,12 @@
       <w:pPr>
         <w:pStyle w:val="-"/>
         <w:ind w:firstLine="0"/>
-        <w:rPr>
-          <w:lang w:val="en-US"/>
-        </w:rPr>
-      </w:pPr>
-    </w:p>
-    <w:p>
-      <w:pPr>
-        <w:pStyle w:val="-"/>
-        <w:ind w:firstLine="0"/>
-        <w:rPr>
-          <w:lang w:val="en-US"/>
-        </w:rPr>
+      </w:pPr>
+    </w:p>
+    <w:p>
+      <w:pPr>
+        <w:pStyle w:val="-"/>
+        <w:ind w:firstLine="0"/>
       </w:pPr>
     </w:p>
     <w:p>
@@ -4353,9 +6644,6 @@
       <w:pPr>
         <w:pStyle w:val="-"/>
         <w:ind w:firstLine="0"/>
-        <w:rPr>
-          <w:lang w:val="en-US"/>
-        </w:rPr>
       </w:pPr>
     </w:p>
     <w:sectPr>
@@ -7178,6 +9466,7 @@
   <w:style w:type="character" w:default="1" w:styleId="a0">
     <w:name w:val="Default Paragraph Font"/>
     <w:uiPriority w:val="1"/>
+    <w:semiHidden/>
     <w:unhideWhenUsed/>
   </w:style>
   <w:style w:type="table" w:default="1" w:styleId="a1">

</xml_diff>